<commit_message>
recherche IA + L07 outilsGestion
</commit_message>
<xml_diff>
--- a/Outils et Materiels/Recherche IA.docx
+++ b/Outils et Materiels/Recherche IA.docx
@@ -1,10 +1,10 @@
 
 <file path=word/document.xml><?xml version="1.0" encoding="utf-8"?>
-<w:document xmlns:wpc="http://schemas.microsoft.com/office/word/2010/wordprocessingCanvas" xmlns:cx="http://schemas.microsoft.com/office/drawing/2014/chartex" xmlns:cx1="http://schemas.microsoft.com/office/drawing/2015/9/8/chartex" xmlns:cx2="http://schemas.microsoft.com/office/drawing/2015/10/21/chartex" xmlns:cx3="http://schemas.microsoft.com/office/drawing/2016/5/9/chartex" xmlns:cx4="http://schemas.microsoft.com/office/drawing/2016/5/10/chartex" xmlns:cx5="http://schemas.microsoft.com/office/drawing/2016/5/11/chartex" xmlns:cx6="http://schemas.microsoft.com/office/drawing/2016/5/12/chartex" xmlns:cx7="http://schemas.microsoft.com/office/drawing/2016/5/13/chartex" xmlns:cx8="http://schemas.microsoft.com/office/drawing/2016/5/14/chartex" xmlns:mc="http://schemas.openxmlformats.org/markup-compatibility/2006" xmlns:aink="http://schemas.microsoft.com/office/drawing/2016/ink" xmlns:am3d="http://schemas.microsoft.com/office/drawing/2017/model3d" xmlns:o="urn:schemas-microsoft-com:office:office" xmlns:oel="http://schemas.microsoft.com/office/2019/extlst" xmlns:r="http://schemas.openxmlformats.org/officeDocument/2006/relationships" xmlns:m="http://schemas.openxmlformats.org/officeDocument/2006/math" xmlns:v="urn:schemas-microsoft-com:vml" xmlns:wp14="http://schemas.microsoft.com/office/word/2010/wordprocessingDrawing" xmlns:wp="http://schemas.openxmlformats.org/drawingml/2006/wordprocessingDrawing" xmlns:w10="urn:schemas-microsoft-com:office:word" xmlns:w="http://schemas.openxmlformats.org/wordprocessingml/2006/main" xmlns:w14="http://schemas.microsoft.com/office/word/2010/wordml" xmlns:w15="http://schemas.microsoft.com/office/word/2012/wordml" xmlns:w16cex="http://schemas.microsoft.com/office/word/2018/wordml/cex" xmlns:w16cid="http://schemas.microsoft.com/office/word/2016/wordml/cid" xmlns:w16="http://schemas.microsoft.com/office/word/2018/wordml" xmlns:w16du="http://schemas.microsoft.com/office/word/2023/wordml/word16du" xmlns:w16sdtdh="http://schemas.microsoft.com/office/word/2020/wordml/sdtdatahash" xmlns:w16sdtfl="http://schemas.microsoft.com/office/word/2024/wordml/sdtformatlock" xmlns:w16se="http://schemas.microsoft.com/office/word/2015/wordml/symex" xmlns:wpg="http://schemas.microsoft.com/office/word/2010/wordprocessingGroup" xmlns:wpi="http://schemas.microsoft.com/office/word/2010/wordprocessingInk" xmlns:wne="http://schemas.microsoft.com/office/word/2006/wordml" xmlns:wps="http://schemas.microsoft.com/office/word/2010/wordprocessingShape" mc:Ignorable="w14 w15 w16se w16cid w16 w16cex w16sdtdh w16sdtfl w16du wp14">
+<w:document xmlns:wpc="http://schemas.microsoft.com/office/word/2010/wordprocessingCanvas" xmlns:cx="http://schemas.microsoft.com/office/drawing/2014/chartex" xmlns:cx1="http://schemas.microsoft.com/office/drawing/2015/9/8/chartex" xmlns:cx2="http://schemas.microsoft.com/office/drawing/2015/10/21/chartex" xmlns:cx3="http://schemas.microsoft.com/office/drawing/2016/5/9/chartex" xmlns:cx4="http://schemas.microsoft.com/office/drawing/2016/5/10/chartex" xmlns:cx5="http://schemas.microsoft.com/office/drawing/2016/5/11/chartex" xmlns:cx6="http://schemas.microsoft.com/office/drawing/2016/5/12/chartex" xmlns:cx7="http://schemas.microsoft.com/office/drawing/2016/5/13/chartex" xmlns:cx8="http://schemas.microsoft.com/office/drawing/2016/5/14/chartex" xmlns:mc="http://schemas.openxmlformats.org/markup-compatibility/2006" xmlns:aink="http://schemas.microsoft.com/office/drawing/2016/ink" xmlns:am3d="http://schemas.microsoft.com/office/drawing/2017/model3d" xmlns:o="urn:schemas-microsoft-com:office:office" xmlns:oel="http://schemas.microsoft.com/office/2019/extlst" xmlns:r="http://schemas.openxmlformats.org/officeDocument/2006/relationships" xmlns:m="http://schemas.openxmlformats.org/officeDocument/2006/math" xmlns:v="urn:schemas-microsoft-com:vml" xmlns:wp14="http://schemas.microsoft.com/office/word/2010/wordprocessingDrawing" xmlns:wp="http://schemas.openxmlformats.org/drawingml/2006/wordprocessingDrawing" xmlns:w10="urn:schemas-microsoft-com:office:word" xmlns:w="http://schemas.openxmlformats.org/wordprocessingml/2006/main" xmlns:w14="http://schemas.microsoft.com/office/word/2010/wordml" xmlns:w15="http://schemas.microsoft.com/office/word/2012/wordml" xmlns:w16cei="http://schemas.microsoft.com/office/word/2026/wordml/cei" xmlns:w16cex="http://schemas.microsoft.com/office/word/2018/wordml/cex" xmlns:w16cid="http://schemas.microsoft.com/office/word/2016/wordml/cid" xmlns:w16="http://schemas.microsoft.com/office/word/2018/wordml" xmlns:w16du="http://schemas.microsoft.com/office/word/2023/wordml/word16du" xmlns:w16sdtdh="http://schemas.microsoft.com/office/word/2020/wordml/sdtdatahash" xmlns:w16sdtfl="http://schemas.microsoft.com/office/word/2024/wordml/sdtformatlock" xmlns:w16se="http://schemas.microsoft.com/office/word/2015/wordml/symex" xmlns:wpg="http://schemas.microsoft.com/office/word/2010/wordprocessingGroup" xmlns:wpi="http://schemas.microsoft.com/office/word/2010/wordprocessingInk" xmlns:wne="http://schemas.microsoft.com/office/word/2006/wordml" xmlns:wps="http://schemas.microsoft.com/office/word/2010/wordprocessingShape" mc:Ignorable="w14 w15 w16se w16cid w16 w16cex w16sdtdh w16sdtfl w16du wp14">
   <w:body>
     <w:p>
       <w:pPr>
-        <w:pStyle w:val="Titre"/>
+        <w:pStyle w:val="Titre10"/>
       </w:pPr>
       <w:r>
         <w:t>Tâche de recherche éthique et technique : centres de données pour l'IA</w:t>
@@ -14,7 +14,7 @@
     <w:p/>
     <w:p>
       <w:pPr>
-        <w:pStyle w:val="ListParagraph"/>
+        <w:pStyle w:val="Paragraphedeliste"/>
         <w:numPr>
           <w:ilvl w:val="0"/>
           <w:numId w:val="1"/>
@@ -34,7 +34,7 @@
     </w:p>
     <w:p>
       <w:pPr>
-        <w:pStyle w:val="ListParagraph"/>
+        <w:pStyle w:val="Paragraphedeliste"/>
         <w:numPr>
           <w:ilvl w:val="0"/>
           <w:numId w:val="2"/>
@@ -51,7 +51,7 @@
     </w:p>
     <w:p>
       <w:pPr>
-        <w:pStyle w:val="ListParagraph"/>
+        <w:pStyle w:val="Paragraphedeliste"/>
         <w:numPr>
           <w:ilvl w:val="0"/>
           <w:numId w:val="2"/>
@@ -76,7 +76,7 @@
     </w:p>
     <w:p>
       <w:pPr>
-        <w:pStyle w:val="ListParagraph"/>
+        <w:pStyle w:val="Paragraphedeliste"/>
         <w:numPr>
           <w:ilvl w:val="0"/>
           <w:numId w:val="2"/>
@@ -88,7 +88,7 @@
     </w:p>
     <w:p>
       <w:pPr>
-        <w:pStyle w:val="ListParagraph"/>
+        <w:pStyle w:val="Paragraphedeliste"/>
         <w:numPr>
           <w:ilvl w:val="0"/>
           <w:numId w:val="2"/>
@@ -100,7 +100,7 @@
     </w:p>
     <w:p>
       <w:pPr>
-        <w:pStyle w:val="ListParagraph"/>
+        <w:pStyle w:val="Paragraphedeliste"/>
         <w:numPr>
           <w:ilvl w:val="0"/>
           <w:numId w:val="1"/>
@@ -120,7 +120,7 @@
     </w:p>
     <w:p>
       <w:pPr>
-        <w:pStyle w:val="ListParagraph"/>
+        <w:pStyle w:val="Paragraphedeliste"/>
         <w:numPr>
           <w:ilvl w:val="0"/>
           <w:numId w:val="2"/>
@@ -137,7 +137,7 @@
     </w:p>
     <w:p>
       <w:pPr>
-        <w:pStyle w:val="ListParagraph"/>
+        <w:pStyle w:val="Paragraphedeliste"/>
         <w:numPr>
           <w:ilvl w:val="0"/>
           <w:numId w:val="2"/>
@@ -154,7 +154,7 @@
     </w:p>
     <w:p>
       <w:pPr>
-        <w:pStyle w:val="ListParagraph"/>
+        <w:pStyle w:val="Paragraphedeliste"/>
         <w:numPr>
           <w:ilvl w:val="0"/>
           <w:numId w:val="2"/>
@@ -176,7 +176,7 @@
     </w:p>
     <w:p>
       <w:pPr>
-        <w:pStyle w:val="ListParagraph"/>
+        <w:pStyle w:val="Paragraphedeliste"/>
         <w:numPr>
           <w:ilvl w:val="0"/>
           <w:numId w:val="2"/>
@@ -188,7 +188,7 @@
     </w:p>
     <w:p>
       <w:pPr>
-        <w:pStyle w:val="ListParagraph"/>
+        <w:pStyle w:val="Paragraphedeliste"/>
         <w:numPr>
           <w:ilvl w:val="0"/>
           <w:numId w:val="2"/>
@@ -200,7 +200,7 @@
     </w:p>
     <w:p>
       <w:pPr>
-        <w:pStyle w:val="ListParagraph"/>
+        <w:pStyle w:val="Paragraphedeliste"/>
         <w:numPr>
           <w:ilvl w:val="0"/>
           <w:numId w:val="1"/>
@@ -236,7 +236,7 @@
     </w:p>
     <w:p>
       <w:pPr>
-        <w:pStyle w:val="ListParagraph"/>
+        <w:pStyle w:val="Paragraphedeliste"/>
         <w:numPr>
           <w:ilvl w:val="0"/>
           <w:numId w:val="2"/>
@@ -250,7 +250,7 @@
     </w:p>
     <w:p>
       <w:pPr>
-        <w:pStyle w:val="ListParagraph"/>
+        <w:pStyle w:val="Paragraphedeliste"/>
         <w:numPr>
           <w:ilvl w:val="0"/>
           <w:numId w:val="2"/>
@@ -262,7 +262,7 @@
     </w:p>
     <w:p>
       <w:pPr>
-        <w:pStyle w:val="ListParagraph"/>
+        <w:pStyle w:val="Paragraphedeliste"/>
         <w:numPr>
           <w:ilvl w:val="0"/>
           <w:numId w:val="2"/>
@@ -274,7 +274,7 @@
     </w:p>
     <w:p>
       <w:pPr>
-        <w:pStyle w:val="ListParagraph"/>
+        <w:pStyle w:val="Paragraphedeliste"/>
         <w:numPr>
           <w:ilvl w:val="0"/>
           <w:numId w:val="2"/>
@@ -302,7 +302,7 @@
     </w:p>
     <w:p>
       <w:pPr>
-        <w:pStyle w:val="ListParagraph"/>
+        <w:pStyle w:val="Paragraphedeliste"/>
         <w:numPr>
           <w:ilvl w:val="0"/>
           <w:numId w:val="2"/>
@@ -314,7 +314,7 @@
     </w:p>
     <w:p>
       <w:pPr>
-        <w:pStyle w:val="ListParagraph"/>
+        <w:pStyle w:val="Paragraphedeliste"/>
         <w:numPr>
           <w:ilvl w:val="0"/>
           <w:numId w:val="2"/>
@@ -326,7 +326,7 @@
     </w:p>
     <w:p>
       <w:pPr>
-        <w:pStyle w:val="ListParagraph"/>
+        <w:pStyle w:val="Paragraphedeliste"/>
         <w:numPr>
           <w:ilvl w:val="0"/>
           <w:numId w:val="1"/>
@@ -357,19 +357,12 @@
           <w:b/>
           <w:bCs/>
         </w:rPr>
-        <w:t xml:space="preserve"> </w:t>
-      </w:r>
-      <w:r>
-        <w:rPr>
-          <w:b/>
-          <w:bCs/>
-        </w:rPr>
-        <w:t>éthique</w:t>
-      </w:r>
-    </w:p>
-    <w:p>
-      <w:pPr>
-        <w:pStyle w:val="ListParagraph"/>
+        <w:t xml:space="preserve"> éthique</w:t>
+      </w:r>
+    </w:p>
+    <w:p>
+      <w:pPr>
+        <w:pStyle w:val="Paragraphedeliste"/>
         <w:numPr>
           <w:ilvl w:val="0"/>
           <w:numId w:val="2"/>
@@ -381,7 +374,7 @@
     </w:p>
     <w:p>
       <w:pPr>
-        <w:pStyle w:val="ListParagraph"/>
+        <w:pStyle w:val="Paragraphedeliste"/>
         <w:numPr>
           <w:ilvl w:val="0"/>
           <w:numId w:val="2"/>
@@ -393,7 +386,7 @@
     </w:p>
     <w:p>
       <w:pPr>
-        <w:pStyle w:val="ListParagraph"/>
+        <w:pStyle w:val="Paragraphedeliste"/>
         <w:numPr>
           <w:ilvl w:val="0"/>
           <w:numId w:val="2"/>
@@ -415,40 +408,2793 @@
     </w:p>
     <w:p/>
     <w:p/>
-    <w:p>
-      <w:hyperlink r:id="rId5" w:history="1">
-        <w:r>
-          <w:rPr>
-            <w:rStyle w:val="Hyperlink"/>
+    <w:p/>
+    <w:p/>
+    <w:p>
+      <w:pPr>
+        <w:jc w:val="both"/>
+        <w:rPr>
+          <w:sz w:val="44"/>
+          <w:szCs w:val="44"/>
+        </w:rPr>
+      </w:pPr>
+      <w:r>
+        <w:rPr>
+          <w:sz w:val="44"/>
+          <w:szCs w:val="44"/>
+        </w:rPr>
+        <w:t>Notes:</w:t>
+      </w:r>
+    </w:p>
+    <w:p>
+      <w:pPr>
+        <w:jc w:val="both"/>
+      </w:pPr>
+      <w:r>
+        <w:rPr>
+          <w:b/>
+          <w:bCs/>
+        </w:rPr>
+        <w:t xml:space="preserve">The </w:t>
+      </w:r>
+      <w:proofErr w:type="spellStart"/>
+      <w:r>
+        <w:rPr>
+          <w:b/>
+          <w:bCs/>
+        </w:rPr>
+        <w:t>average</w:t>
+      </w:r>
+      <w:proofErr w:type="spellEnd"/>
+      <w:r>
+        <w:rPr>
+          <w:b/>
+          <w:bCs/>
+        </w:rPr>
+        <w:t xml:space="preserve"> data center </w:t>
+      </w:r>
+      <w:proofErr w:type="spellStart"/>
+      <w:r>
+        <w:rPr>
+          <w:b/>
+          <w:bCs/>
+        </w:rPr>
+        <w:t>is</w:t>
+      </w:r>
+      <w:proofErr w:type="spellEnd"/>
+      <w:r>
+        <w:rPr>
+          <w:b/>
+          <w:bCs/>
+        </w:rPr>
+        <w:t> </w:t>
+      </w:r>
+      <w:hyperlink r:id="rId8" w:history="1">
+        <w:r>
+          <w:rPr>
+            <w:rStyle w:val="Lienhypertexte"/>
+            <w:b/>
+            <w:bCs/>
+          </w:rPr>
+          <w:t>about</w:t>
+        </w:r>
+      </w:hyperlink>
+      <w:r>
+        <w:rPr>
+          <w:b/>
+          <w:bCs/>
+        </w:rPr>
+        <w:t xml:space="preserve"> 100,000 </w:t>
+      </w:r>
+      <w:proofErr w:type="gramStart"/>
+      <w:r>
+        <w:rPr>
+          <w:b/>
+          <w:bCs/>
+        </w:rPr>
+        <w:t>square</w:t>
+      </w:r>
+      <w:proofErr w:type="gramEnd"/>
+      <w:r>
+        <w:rPr>
+          <w:b/>
+          <w:bCs/>
+        </w:rPr>
+        <w:t xml:space="preserve"> </w:t>
+      </w:r>
+      <w:proofErr w:type="spellStart"/>
+      <w:r>
+        <w:rPr>
+          <w:b/>
+          <w:bCs/>
+        </w:rPr>
+        <w:t>feet</w:t>
+      </w:r>
+      <w:proofErr w:type="spellEnd"/>
+      <w:r>
+        <w:rPr>
+          <w:b/>
+          <w:bCs/>
+        </w:rPr>
+        <w:t>,</w:t>
+      </w:r>
+      <w:r>
+        <w:t xml:space="preserve"> comparable to the </w:t>
+      </w:r>
+      <w:proofErr w:type="spellStart"/>
+      <w:r>
+        <w:t>average</w:t>
+      </w:r>
+      <w:proofErr w:type="spellEnd"/>
+      <w:r>
+        <w:t> </w:t>
+      </w:r>
+      <w:hyperlink r:id="rId9" w:history="1">
+        <w:r>
+          <w:rPr>
+            <w:rStyle w:val="Lienhypertexte"/>
+          </w:rPr>
+          <w:t xml:space="preserve">Walmart </w:t>
+        </w:r>
+        <w:proofErr w:type="spellStart"/>
+        <w:r>
+          <w:rPr>
+            <w:rStyle w:val="Lienhypertexte"/>
+          </w:rPr>
+          <w:t>Supercenter</w:t>
+        </w:r>
+        <w:proofErr w:type="spellEnd"/>
+      </w:hyperlink>
+      <w:r>
+        <w:t> or </w:t>
+      </w:r>
+      <w:hyperlink r:id="rId10" w:history="1">
+        <w:r>
+          <w:rPr>
+            <w:rStyle w:val="Lienhypertexte"/>
+          </w:rPr>
+          <w:t xml:space="preserve">Costco </w:t>
+        </w:r>
+        <w:proofErr w:type="spellStart"/>
+        <w:r>
+          <w:rPr>
+            <w:rStyle w:val="Lienhypertexte"/>
+          </w:rPr>
+          <w:t>warehouse</w:t>
+        </w:r>
+        <w:proofErr w:type="spellEnd"/>
+      </w:hyperlink>
+    </w:p>
+    <w:p>
+      <w:pPr>
+        <w:jc w:val="both"/>
+      </w:pPr>
+    </w:p>
+    <w:p>
+      <w:pPr>
+        <w:jc w:val="both"/>
+      </w:pPr>
+      <w:r>
+        <w:t xml:space="preserve">Data centers have been </w:t>
+      </w:r>
+      <w:proofErr w:type="spellStart"/>
+      <w:r>
+        <w:t>around</w:t>
+      </w:r>
+      <w:proofErr w:type="spellEnd"/>
+      <w:r>
+        <w:t xml:space="preserve"> for </w:t>
+      </w:r>
+      <w:proofErr w:type="spellStart"/>
+      <w:r>
+        <w:fldChar w:fldCharType="begin"/>
+      </w:r>
+      <w:r>
+        <w:instrText>HYPERLINK "https://www.enconnex.com/data-center-history-and-evolution/"</w:instrText>
+      </w:r>
+      <w:r>
+        <w:fldChar w:fldCharType="separate"/>
+      </w:r>
+      <w:r>
+        <w:rPr>
+          <w:rStyle w:val="Lienhypertexte"/>
+        </w:rPr>
+        <w:t>decades</w:t>
+      </w:r>
+      <w:proofErr w:type="spellEnd"/>
+      <w:r>
+        <w:fldChar w:fldCharType="end"/>
+      </w:r>
+      <w:r>
+        <w:t xml:space="preserve">; </w:t>
+      </w:r>
+      <w:r>
+        <w:rPr>
+          <w:b/>
+          <w:bCs/>
+        </w:rPr>
+        <w:t xml:space="preserve">the first one </w:t>
+      </w:r>
+      <w:proofErr w:type="spellStart"/>
+      <w:r>
+        <w:rPr>
+          <w:b/>
+          <w:bCs/>
+        </w:rPr>
+        <w:t>in</w:t>
+      </w:r>
+      <w:proofErr w:type="spellEnd"/>
+      <w:r>
+        <w:rPr>
+          <w:b/>
+          <w:bCs/>
+        </w:rPr>
+        <w:t xml:space="preserve"> 1945</w:t>
+      </w:r>
+      <w:r>
+        <w:t xml:space="preserve"> </w:t>
+      </w:r>
+      <w:proofErr w:type="spellStart"/>
+      <w:r>
+        <w:t>housed</w:t>
+      </w:r>
+      <w:proofErr w:type="spellEnd"/>
+      <w:r>
+        <w:t xml:space="preserve"> the </w:t>
+      </w:r>
+      <w:proofErr w:type="spellStart"/>
+      <w:r>
+        <w:fldChar w:fldCharType="begin"/>
+      </w:r>
+      <w:r>
+        <w:instrText>HYPERLINK "https://www.xyzreality.com/resources/evolution-and-future-of-data-centers"</w:instrText>
+      </w:r>
+      <w:r>
+        <w:fldChar w:fldCharType="separate"/>
+      </w:r>
+      <w:r>
+        <w:rPr>
+          <w:rStyle w:val="Lienhypertexte"/>
+        </w:rPr>
+        <w:t>world’s</w:t>
+      </w:r>
+      <w:proofErr w:type="spellEnd"/>
+      <w:r>
+        <w:rPr>
+          <w:rStyle w:val="Lienhypertexte"/>
+        </w:rPr>
+        <w:t xml:space="preserve"> first programmable computer</w:t>
+      </w:r>
+      <w:r>
+        <w:fldChar w:fldCharType="end"/>
+      </w:r>
+      <w:r>
+        <w:t> </w:t>
+      </w:r>
+      <w:proofErr w:type="spellStart"/>
+      <w:r>
+        <w:t>designed</w:t>
+      </w:r>
+      <w:proofErr w:type="spellEnd"/>
+      <w:r>
+        <w:t xml:space="preserve"> to </w:t>
+      </w:r>
+      <w:proofErr w:type="spellStart"/>
+      <w:r>
+        <w:t>calculate</w:t>
+      </w:r>
+      <w:proofErr w:type="spellEnd"/>
+      <w:r>
+        <w:t xml:space="preserve"> U.S. Army </w:t>
+      </w:r>
+      <w:proofErr w:type="spellStart"/>
+      <w:r>
+        <w:t>artillery</w:t>
+      </w:r>
+      <w:proofErr w:type="spellEnd"/>
+      <w:r>
+        <w:t xml:space="preserve"> </w:t>
+      </w:r>
+      <w:proofErr w:type="spellStart"/>
+      <w:r>
+        <w:t>fire</w:t>
+      </w:r>
+      <w:proofErr w:type="spellEnd"/>
+      <w:r>
+        <w:t xml:space="preserve"> </w:t>
+      </w:r>
+      <w:proofErr w:type="spellStart"/>
+      <w:r>
+        <w:t>during</w:t>
+      </w:r>
+      <w:proofErr w:type="spellEnd"/>
+      <w:r>
+        <w:t xml:space="preserve"> World War II.</w:t>
+      </w:r>
+    </w:p>
+    <w:p>
+      <w:pPr>
+        <w:jc w:val="both"/>
+      </w:pPr>
+      <w:r>
+        <w:t xml:space="preserve">Early data centers </w:t>
+      </w:r>
+      <w:proofErr w:type="spellStart"/>
+      <w:r>
+        <w:t>ran</w:t>
+      </w:r>
+      <w:proofErr w:type="spellEnd"/>
+      <w:r>
+        <w:t xml:space="preserve"> </w:t>
+      </w:r>
+      <w:proofErr w:type="spellStart"/>
+      <w:r>
+        <w:t>databases</w:t>
+      </w:r>
+      <w:proofErr w:type="spellEnd"/>
+      <w:r>
+        <w:t xml:space="preserve">, </w:t>
+      </w:r>
+      <w:proofErr w:type="gramStart"/>
+      <w:r>
+        <w:t>email</w:t>
+      </w:r>
+      <w:proofErr w:type="gramEnd"/>
+      <w:r>
+        <w:t xml:space="preserve">, and web </w:t>
+      </w:r>
+      <w:proofErr w:type="spellStart"/>
+      <w:r>
+        <w:t>hosting</w:t>
+      </w:r>
+      <w:proofErr w:type="spellEnd"/>
+      <w:r>
+        <w:t xml:space="preserve">, </w:t>
+      </w:r>
+      <w:proofErr w:type="spellStart"/>
+      <w:r>
+        <w:t>using</w:t>
+      </w:r>
+      <w:proofErr w:type="spellEnd"/>
+      <w:r>
+        <w:t xml:space="preserve"> a </w:t>
+      </w:r>
+      <w:proofErr w:type="spellStart"/>
+      <w:r>
+        <w:t>modest</w:t>
+      </w:r>
+      <w:proofErr w:type="spellEnd"/>
+      <w:r>
+        <w:t xml:space="preserve"> </w:t>
+      </w:r>
+      <w:proofErr w:type="spellStart"/>
+      <w:r>
+        <w:t>amount</w:t>
+      </w:r>
+      <w:proofErr w:type="spellEnd"/>
+      <w:r>
+        <w:t xml:space="preserve"> of power </w:t>
+      </w:r>
+      <w:proofErr w:type="spellStart"/>
+      <w:r>
+        <w:t>that</w:t>
+      </w:r>
+      <w:proofErr w:type="spellEnd"/>
+      <w:r>
+        <w:t xml:space="preserve"> </w:t>
+      </w:r>
+      <w:proofErr w:type="spellStart"/>
+      <w:r>
+        <w:t>varied</w:t>
+      </w:r>
+      <w:proofErr w:type="spellEnd"/>
+      <w:r>
+        <w:t xml:space="preserve"> </w:t>
+      </w:r>
+      <w:proofErr w:type="spellStart"/>
+      <w:r>
+        <w:t>throughout</w:t>
+      </w:r>
+      <w:proofErr w:type="spellEnd"/>
+      <w:r>
+        <w:t xml:space="preserve"> the </w:t>
+      </w:r>
+      <w:proofErr w:type="spellStart"/>
+      <w:r>
+        <w:t>day</w:t>
+      </w:r>
+      <w:proofErr w:type="spellEnd"/>
+      <w:r>
+        <w:t xml:space="preserve">, Nikolopoulos </w:t>
+      </w:r>
+      <w:proofErr w:type="spellStart"/>
+      <w:r>
+        <w:t>said</w:t>
+      </w:r>
+      <w:proofErr w:type="spellEnd"/>
+      <w:r>
+        <w:t xml:space="preserve">. </w:t>
+      </w:r>
+      <w:proofErr w:type="spellStart"/>
+      <w:r>
+        <w:t>Today’s</w:t>
+      </w:r>
+      <w:proofErr w:type="spellEnd"/>
+      <w:r>
+        <w:t xml:space="preserve"> data centers use </w:t>
+      </w:r>
+      <w:proofErr w:type="spellStart"/>
+      <w:r>
+        <w:t>considerably</w:t>
+      </w:r>
+      <w:proofErr w:type="spellEnd"/>
+      <w:r>
+        <w:t xml:space="preserve"> more </w:t>
+      </w:r>
+      <w:proofErr w:type="spellStart"/>
+      <w:r>
+        <w:t>electricity</w:t>
+      </w:r>
+      <w:proofErr w:type="spellEnd"/>
+      <w:r>
+        <w:t xml:space="preserve"> </w:t>
+      </w:r>
+      <w:proofErr w:type="spellStart"/>
+      <w:r>
+        <w:t>because</w:t>
+      </w:r>
+      <w:proofErr w:type="spellEnd"/>
+      <w:r>
+        <w:t xml:space="preserve"> of the </w:t>
+      </w:r>
+      <w:proofErr w:type="spellStart"/>
+      <w:r>
+        <w:t>larger</w:t>
+      </w:r>
+      <w:proofErr w:type="spellEnd"/>
+      <w:r>
+        <w:t xml:space="preserve"> </w:t>
+      </w:r>
+      <w:proofErr w:type="spellStart"/>
+      <w:r>
+        <w:t>amount</w:t>
+      </w:r>
+      <w:proofErr w:type="spellEnd"/>
+      <w:r>
+        <w:t xml:space="preserve"> of information </w:t>
+      </w:r>
+      <w:proofErr w:type="spellStart"/>
+      <w:r>
+        <w:t>they</w:t>
+      </w:r>
+      <w:proofErr w:type="spellEnd"/>
+      <w:r>
+        <w:t xml:space="preserve"> process, </w:t>
+      </w:r>
+      <w:proofErr w:type="spellStart"/>
+      <w:r>
+        <w:t>he</w:t>
+      </w:r>
+      <w:proofErr w:type="spellEnd"/>
+      <w:r>
+        <w:t xml:space="preserve"> </w:t>
+      </w:r>
+      <w:proofErr w:type="spellStart"/>
+      <w:r>
+        <w:t>said</w:t>
+      </w:r>
+      <w:proofErr w:type="spellEnd"/>
+      <w:r>
+        <w:t>.</w:t>
+      </w:r>
+    </w:p>
+    <w:p>
+      <w:pPr>
+        <w:jc w:val="both"/>
+      </w:pPr>
+    </w:p>
+    <w:p>
+      <w:pPr>
+        <w:jc w:val="both"/>
+      </w:pPr>
+      <w:r>
+        <w:t xml:space="preserve">A </w:t>
+      </w:r>
+      <w:proofErr w:type="spellStart"/>
+      <w:r>
+        <w:t>typical</w:t>
+      </w:r>
+      <w:proofErr w:type="spellEnd"/>
+      <w:r>
+        <w:t xml:space="preserve"> AI data center can </w:t>
+      </w:r>
+      <w:hyperlink r:id="rId11" w:history="1">
+        <w:r>
+          <w:rPr>
+            <w:rStyle w:val="Lienhypertexte"/>
+          </w:rPr>
+          <w:t>consume</w:t>
+        </w:r>
+      </w:hyperlink>
+      <w:r>
+        <w:t xml:space="preserve"> as </w:t>
+      </w:r>
+      <w:proofErr w:type="spellStart"/>
+      <w:r>
+        <w:t>much</w:t>
+      </w:r>
+      <w:proofErr w:type="spellEnd"/>
+      <w:r>
+        <w:t xml:space="preserve"> </w:t>
+      </w:r>
+      <w:proofErr w:type="spellStart"/>
+      <w:r>
+        <w:t>electricity</w:t>
+      </w:r>
+      <w:proofErr w:type="spellEnd"/>
+      <w:r>
+        <w:t xml:space="preserve"> </w:t>
+      </w:r>
+      <w:proofErr w:type="spellStart"/>
+      <w:r>
+        <w:t>annually</w:t>
+      </w:r>
+      <w:proofErr w:type="spellEnd"/>
+      <w:r>
+        <w:t xml:space="preserve"> as </w:t>
+      </w:r>
+      <w:r>
+        <w:rPr>
+          <w:b/>
+          <w:bCs/>
+        </w:rPr>
+        <w:t xml:space="preserve">100,000 </w:t>
+      </w:r>
+      <w:proofErr w:type="spellStart"/>
+      <w:r>
+        <w:rPr>
+          <w:b/>
+          <w:bCs/>
+        </w:rPr>
+        <w:t>households</w:t>
+      </w:r>
+      <w:proofErr w:type="spellEnd"/>
+      <w:r>
+        <w:rPr>
+          <w:b/>
+          <w:bCs/>
+        </w:rPr>
+        <w:t>;</w:t>
+      </w:r>
+      <w:r>
+        <w:t xml:space="preserve"> the </w:t>
+      </w:r>
+      <w:proofErr w:type="spellStart"/>
+      <w:r>
+        <w:t>largest</w:t>
+      </w:r>
+      <w:proofErr w:type="spellEnd"/>
+      <w:r>
+        <w:t xml:space="preserve"> data centers </w:t>
+      </w:r>
+      <w:proofErr w:type="spellStart"/>
+      <w:r>
+        <w:t>under</w:t>
+      </w:r>
+      <w:proofErr w:type="spellEnd"/>
+      <w:r>
+        <w:t xml:space="preserve"> construction </w:t>
+      </w:r>
+      <w:proofErr w:type="spellStart"/>
+      <w:r>
+        <w:t>will</w:t>
+      </w:r>
+      <w:proofErr w:type="spellEnd"/>
+      <w:r>
+        <w:t xml:space="preserve"> </w:t>
+      </w:r>
+      <w:proofErr w:type="spellStart"/>
+      <w:r>
+        <w:t>demand</w:t>
+      </w:r>
+      <w:proofErr w:type="spellEnd"/>
+      <w:r>
+        <w:t xml:space="preserve"> 20 times </w:t>
+      </w:r>
+      <w:proofErr w:type="spellStart"/>
+      <w:r>
+        <w:t>that</w:t>
+      </w:r>
+      <w:proofErr w:type="spellEnd"/>
+      <w:r>
+        <w:t xml:space="preserve"> </w:t>
+      </w:r>
+      <w:proofErr w:type="spellStart"/>
+      <w:r>
+        <w:t>amount</w:t>
+      </w:r>
+      <w:proofErr w:type="spellEnd"/>
+      <w:r>
+        <w:t>, the International Energy Agency </w:t>
+      </w:r>
+      <w:proofErr w:type="spellStart"/>
+      <w:r>
+        <w:fldChar w:fldCharType="begin"/>
+      </w:r>
+      <w:r>
+        <w:instrText>HYPERLINK "https://www.iea.org/reports/energy-and-ai/energy-demand-from-ai"</w:instrText>
+      </w:r>
+      <w:r>
+        <w:fldChar w:fldCharType="separate"/>
+      </w:r>
+      <w:r>
+        <w:rPr>
+          <w:rStyle w:val="Lienhypertexte"/>
+        </w:rPr>
+        <w:t>estimated</w:t>
+      </w:r>
+      <w:proofErr w:type="spellEnd"/>
+      <w:r>
+        <w:fldChar w:fldCharType="end"/>
+      </w:r>
+      <w:r>
+        <w:t> </w:t>
+      </w:r>
+      <w:proofErr w:type="spellStart"/>
+      <w:r>
+        <w:t>in</w:t>
+      </w:r>
+      <w:proofErr w:type="spellEnd"/>
+      <w:r>
+        <w:t xml:space="preserve"> 2025.</w:t>
+      </w:r>
+    </w:p>
+    <w:p>
+      <w:pPr>
+        <w:jc w:val="both"/>
+      </w:pPr>
+    </w:p>
+    <w:p>
+      <w:pPr>
+        <w:jc w:val="both"/>
+      </w:pPr>
+      <w:proofErr w:type="spellStart"/>
+      <w:r>
+        <w:t>In</w:t>
+      </w:r>
+      <w:proofErr w:type="spellEnd"/>
+      <w:r>
+        <w:t xml:space="preserve"> 2024, data centers </w:t>
+      </w:r>
+      <w:proofErr w:type="spellStart"/>
+      <w:r>
+        <w:t>worldwide</w:t>
+      </w:r>
+      <w:proofErr w:type="spellEnd"/>
+      <w:r>
+        <w:t xml:space="preserve"> </w:t>
+      </w:r>
+      <w:proofErr w:type="spellStart"/>
+      <w:r>
+        <w:t>consumed</w:t>
+      </w:r>
+      <w:proofErr w:type="spellEnd"/>
+      <w:r>
+        <w:t xml:space="preserve"> about </w:t>
+      </w:r>
+      <w:hyperlink r:id="rId12" w:history="1">
+        <w:r>
+          <w:rPr>
+            <w:rStyle w:val="Lienhypertexte"/>
+          </w:rPr>
+          <w:t xml:space="preserve">415 </w:t>
+        </w:r>
+        <w:proofErr w:type="spellStart"/>
+        <w:r>
+          <w:rPr>
+            <w:rStyle w:val="Lienhypertexte"/>
+          </w:rPr>
+          <w:t>terawatt</w:t>
+        </w:r>
+        <w:proofErr w:type="spellEnd"/>
+        <w:r>
+          <w:rPr>
+            <w:rStyle w:val="Lienhypertexte"/>
+          </w:rPr>
+          <w:t xml:space="preserve"> </w:t>
+        </w:r>
+        <w:proofErr w:type="spellStart"/>
+        <w:r>
+          <w:rPr>
+            <w:rStyle w:val="Lienhypertexte"/>
+          </w:rPr>
+          <w:t>hours</w:t>
+        </w:r>
+        <w:proofErr w:type="spellEnd"/>
+      </w:hyperlink>
+      <w:r>
+        <w:t>, or about 1.5% of the </w:t>
+      </w:r>
+      <w:proofErr w:type="spellStart"/>
+      <w:r>
+        <w:fldChar w:fldCharType="begin"/>
+      </w:r>
+      <w:r>
+        <w:instrText>HYPERLINK "https://www.brookings.edu/articles/global-energy-demands-within-the-ai-regulatory-landscape/"</w:instrText>
+      </w:r>
+      <w:r>
+        <w:fldChar w:fldCharType="separate"/>
+      </w:r>
+      <w:r>
+        <w:rPr>
+          <w:rStyle w:val="Lienhypertexte"/>
+        </w:rPr>
+        <w:t>world’s</w:t>
+      </w:r>
+      <w:proofErr w:type="spellEnd"/>
+      <w:r>
+        <w:rPr>
+          <w:rStyle w:val="Lienhypertexte"/>
+        </w:rPr>
+        <w:t xml:space="preserve"> total </w:t>
+      </w:r>
+      <w:proofErr w:type="spellStart"/>
+      <w:r>
+        <w:rPr>
+          <w:rStyle w:val="Lienhypertexte"/>
+        </w:rPr>
+        <w:t>electricity</w:t>
+      </w:r>
+      <w:proofErr w:type="spellEnd"/>
+      <w:r>
+        <w:rPr>
+          <w:rStyle w:val="Lienhypertexte"/>
+        </w:rPr>
+        <w:t xml:space="preserve"> use</w:t>
+      </w:r>
+      <w:r>
+        <w:fldChar w:fldCharType="end"/>
+      </w:r>
+      <w:r>
+        <w:t xml:space="preserve">, </w:t>
+      </w:r>
+      <w:proofErr w:type="spellStart"/>
+      <w:r>
+        <w:t>according</w:t>
+      </w:r>
+      <w:proofErr w:type="spellEnd"/>
+      <w:r>
+        <w:t xml:space="preserve"> to the International Energy Agency.</w:t>
+      </w:r>
+    </w:p>
+    <w:p>
+      <w:pPr>
+        <w:jc w:val="both"/>
+      </w:pPr>
+    </w:p>
+    <w:p>
+      <w:pPr>
+        <w:jc w:val="both"/>
+      </w:pPr>
+      <w:r>
+        <w:t xml:space="preserve">The Lawrence Berkeley National </w:t>
+      </w:r>
+      <w:proofErr w:type="spellStart"/>
+      <w:r>
+        <w:t>Laboratory</w:t>
+      </w:r>
+      <w:proofErr w:type="spellEnd"/>
+      <w:r>
+        <w:t xml:space="preserve">, a </w:t>
+      </w:r>
+      <w:proofErr w:type="spellStart"/>
+      <w:r>
+        <w:t>federal</w:t>
+      </w:r>
+      <w:proofErr w:type="spellEnd"/>
+      <w:r>
+        <w:t xml:space="preserve"> </w:t>
+      </w:r>
+      <w:proofErr w:type="spellStart"/>
+      <w:r>
+        <w:t>research</w:t>
+      </w:r>
+      <w:proofErr w:type="spellEnd"/>
+      <w:r>
+        <w:t xml:space="preserve"> center, in </w:t>
+      </w:r>
+      <w:proofErr w:type="gramStart"/>
+      <w:r>
+        <w:t>a</w:t>
+      </w:r>
+      <w:proofErr w:type="gramEnd"/>
+      <w:r>
+        <w:t xml:space="preserve"> June </w:t>
+      </w:r>
+      <w:hyperlink r:id="rId13" w:history="1">
+        <w:r>
+          <w:rPr>
+            <w:rStyle w:val="Lienhypertexte"/>
+          </w:rPr>
+          <w:t>report</w:t>
+        </w:r>
+      </w:hyperlink>
+      <w:r>
+        <w:t> </w:t>
+      </w:r>
+      <w:proofErr w:type="spellStart"/>
+      <w:r>
+        <w:t>said</w:t>
+      </w:r>
+      <w:proofErr w:type="spellEnd"/>
+      <w:r>
+        <w:t xml:space="preserve"> </w:t>
+      </w:r>
+      <w:proofErr w:type="spellStart"/>
+      <w:r>
+        <w:t>that</w:t>
+      </w:r>
+      <w:proofErr w:type="spellEnd"/>
+      <w:r>
+        <w:t xml:space="preserve"> by 2030, the total power </w:t>
+      </w:r>
+      <w:proofErr w:type="spellStart"/>
+      <w:r>
+        <w:t>demand</w:t>
+      </w:r>
+      <w:proofErr w:type="spellEnd"/>
+      <w:r>
+        <w:t xml:space="preserve"> for data centers </w:t>
+      </w:r>
+      <w:proofErr w:type="spellStart"/>
+      <w:r>
+        <w:t>would</w:t>
+      </w:r>
+      <w:proofErr w:type="spellEnd"/>
+      <w:r>
+        <w:t xml:space="preserve"> </w:t>
+      </w:r>
+      <w:proofErr w:type="spellStart"/>
+      <w:r>
+        <w:t>account</w:t>
+      </w:r>
+      <w:proofErr w:type="spellEnd"/>
+      <w:r>
+        <w:t xml:space="preserve"> for 9.5% to 15.3% of </w:t>
+      </w:r>
+      <w:proofErr w:type="spellStart"/>
+      <w:r>
+        <w:t>that</w:t>
+      </w:r>
+      <w:proofErr w:type="spellEnd"/>
+      <w:r>
+        <w:t xml:space="preserve"> </w:t>
+      </w:r>
+      <w:proofErr w:type="spellStart"/>
+      <w:r>
+        <w:t>year’s</w:t>
+      </w:r>
+      <w:proofErr w:type="spellEnd"/>
+      <w:r>
+        <w:t xml:space="preserve"> total U.S. </w:t>
+      </w:r>
+      <w:proofErr w:type="spellStart"/>
+      <w:r>
+        <w:t>electricity</w:t>
+      </w:r>
+      <w:proofErr w:type="spellEnd"/>
+      <w:r>
+        <w:t xml:space="preserve"> </w:t>
+      </w:r>
+      <w:proofErr w:type="spellStart"/>
+      <w:r>
+        <w:t>consumption</w:t>
+      </w:r>
+      <w:proofErr w:type="spellEnd"/>
+      <w:r>
+        <w:t>.</w:t>
+      </w:r>
+    </w:p>
+    <w:p>
+      <w:pPr>
+        <w:jc w:val="both"/>
+      </w:pPr>
+      <w:r>
+        <w:rPr>
+          <w:b/>
+          <w:bCs/>
+        </w:rPr>
+        <w:t xml:space="preserve">The centers have large air </w:t>
+      </w:r>
+      <w:proofErr w:type="spellStart"/>
+      <w:r>
+        <w:rPr>
+          <w:b/>
+          <w:bCs/>
+        </w:rPr>
+        <w:t>conditioning</w:t>
+      </w:r>
+      <w:proofErr w:type="spellEnd"/>
+      <w:r>
+        <w:rPr>
+          <w:b/>
+          <w:bCs/>
+        </w:rPr>
+        <w:t xml:space="preserve"> </w:t>
+      </w:r>
+      <w:proofErr w:type="spellStart"/>
+      <w:r>
+        <w:rPr>
+          <w:b/>
+          <w:bCs/>
+        </w:rPr>
+        <w:t>units</w:t>
+      </w:r>
+      <w:proofErr w:type="spellEnd"/>
+      <w:r>
+        <w:rPr>
+          <w:b/>
+          <w:bCs/>
+        </w:rPr>
+        <w:t xml:space="preserve">, fans and </w:t>
+      </w:r>
+      <w:proofErr w:type="spellStart"/>
+      <w:r>
+        <w:rPr>
+          <w:b/>
+          <w:bCs/>
+        </w:rPr>
+        <w:t>chilled</w:t>
+      </w:r>
+      <w:proofErr w:type="spellEnd"/>
+      <w:r>
+        <w:rPr>
+          <w:b/>
+          <w:bCs/>
+        </w:rPr>
+        <w:t xml:space="preserve"> water pipes</w:t>
+      </w:r>
+      <w:r>
+        <w:t xml:space="preserve"> </w:t>
+      </w:r>
+      <w:proofErr w:type="spellStart"/>
+      <w:r>
+        <w:t>that</w:t>
+      </w:r>
+      <w:proofErr w:type="spellEnd"/>
+      <w:r>
+        <w:t xml:space="preserve"> cool the computers, </w:t>
+      </w:r>
+      <w:proofErr w:type="spellStart"/>
+      <w:r>
+        <w:t>which</w:t>
+      </w:r>
+      <w:proofErr w:type="spellEnd"/>
+      <w:r>
+        <w:t xml:space="preserve"> </w:t>
+      </w:r>
+      <w:proofErr w:type="spellStart"/>
+      <w:r>
+        <w:t>generate</w:t>
+      </w:r>
+      <w:proofErr w:type="spellEnd"/>
+      <w:r>
+        <w:t xml:space="preserve"> a lot of </w:t>
+      </w:r>
+      <w:proofErr w:type="spellStart"/>
+      <w:r>
+        <w:t>heat</w:t>
+      </w:r>
+      <w:proofErr w:type="spellEnd"/>
+      <w:r>
+        <w:t xml:space="preserve"> </w:t>
+      </w:r>
+      <w:proofErr w:type="spellStart"/>
+      <w:r>
+        <w:t>while</w:t>
+      </w:r>
+      <w:proofErr w:type="spellEnd"/>
+      <w:r>
+        <w:t xml:space="preserve"> </w:t>
+      </w:r>
+      <w:proofErr w:type="spellStart"/>
+      <w:r>
+        <w:t>continuously</w:t>
+      </w:r>
+      <w:proofErr w:type="spellEnd"/>
+      <w:r>
+        <w:t xml:space="preserve"> running</w:t>
+      </w:r>
+    </w:p>
+    <w:p>
+      <w:pPr>
+        <w:jc w:val="both"/>
+      </w:pPr>
+    </w:p>
+    <w:p>
+      <w:pPr>
+        <w:jc w:val="both"/>
+      </w:pPr>
+    </w:p>
+    <w:p>
+      <w:pPr>
+        <w:jc w:val="both"/>
+      </w:pPr>
+      <w:r>
+        <w:t xml:space="preserve">“Every </w:t>
+      </w:r>
+      <w:proofErr w:type="spellStart"/>
+      <w:r>
+        <w:t>day</w:t>
+      </w:r>
+      <w:proofErr w:type="spellEnd"/>
+      <w:r>
+        <w:t xml:space="preserve"> digital communications like the internet, </w:t>
+      </w:r>
+      <w:proofErr w:type="spellStart"/>
+      <w:r>
+        <w:t>banking</w:t>
+      </w:r>
+      <w:proofErr w:type="spellEnd"/>
+      <w:r>
+        <w:t xml:space="preserve">, </w:t>
+      </w:r>
+      <w:proofErr w:type="spellStart"/>
+      <w:r>
+        <w:t>healthcare</w:t>
+      </w:r>
+      <w:proofErr w:type="spellEnd"/>
+      <w:r>
+        <w:t xml:space="preserve"> </w:t>
+      </w:r>
+      <w:proofErr w:type="spellStart"/>
+      <w:r>
+        <w:t>systems</w:t>
+      </w:r>
+      <w:proofErr w:type="spellEnd"/>
+      <w:r>
+        <w:t xml:space="preserve">, cloud </w:t>
+      </w:r>
+      <w:proofErr w:type="spellStart"/>
+      <w:r>
+        <w:t>computing</w:t>
+      </w:r>
+      <w:proofErr w:type="spellEnd"/>
+      <w:r>
+        <w:t xml:space="preserve">/gaming, and </w:t>
+      </w:r>
+      <w:proofErr w:type="spellStart"/>
+      <w:r>
+        <w:t>websites</w:t>
+      </w:r>
+      <w:proofErr w:type="spellEnd"/>
+      <w:r>
+        <w:t xml:space="preserve"> all use </w:t>
+      </w:r>
+      <w:proofErr w:type="spellStart"/>
+      <w:r>
+        <w:t>remote</w:t>
+      </w:r>
+      <w:proofErr w:type="spellEnd"/>
+      <w:r>
+        <w:t xml:space="preserve"> servers and </w:t>
+      </w:r>
+      <w:proofErr w:type="spellStart"/>
+      <w:r>
+        <w:t>therefore</w:t>
+      </w:r>
+      <w:proofErr w:type="spellEnd"/>
+      <w:r>
+        <w:t xml:space="preserve"> data centers,” </w:t>
+      </w:r>
+      <w:proofErr w:type="spellStart"/>
+      <w:r>
+        <w:t>said</w:t>
+      </w:r>
+      <w:proofErr w:type="spellEnd"/>
+      <w:r>
+        <w:t xml:space="preserve"> via </w:t>
+      </w:r>
+      <w:proofErr w:type="gramStart"/>
+      <w:r>
+        <w:t>email</w:t>
+      </w:r>
+      <w:proofErr w:type="gramEnd"/>
+      <w:r>
+        <w:t xml:space="preserve"> </w:t>
+      </w:r>
+      <w:proofErr w:type="spellStart"/>
+      <w:r>
+        <w:t>Ke</w:t>
+      </w:r>
+      <w:proofErr w:type="spellEnd"/>
+      <w:r>
+        <w:t xml:space="preserve"> Xu, </w:t>
+      </w:r>
+      <w:proofErr w:type="spellStart"/>
+      <w:proofErr w:type="gramStart"/>
+      <w:r>
+        <w:t>a</w:t>
+      </w:r>
+      <w:proofErr w:type="spellEnd"/>
+      <w:proofErr w:type="gramEnd"/>
+      <w:r>
+        <w:t xml:space="preserve"> Rochester Institute of </w:t>
+      </w:r>
+      <w:proofErr w:type="spellStart"/>
+      <w:r>
+        <w:t>Technology</w:t>
+      </w:r>
+      <w:proofErr w:type="spellEnd"/>
+      <w:r>
+        <w:t xml:space="preserve"> </w:t>
+      </w:r>
+      <w:proofErr w:type="spellStart"/>
+      <w:r>
+        <w:t>professor</w:t>
+      </w:r>
+      <w:proofErr w:type="spellEnd"/>
+      <w:r>
+        <w:t xml:space="preserve"> </w:t>
+      </w:r>
+      <w:proofErr w:type="spellStart"/>
+      <w:r>
+        <w:t>who</w:t>
+      </w:r>
+      <w:proofErr w:type="spellEnd"/>
+      <w:r>
+        <w:t xml:space="preserve"> </w:t>
+      </w:r>
+      <w:proofErr w:type="spellStart"/>
+      <w:r>
+        <w:t>develops</w:t>
+      </w:r>
+      <w:proofErr w:type="spellEnd"/>
+      <w:r>
+        <w:t xml:space="preserve"> </w:t>
+      </w:r>
+      <w:proofErr w:type="spellStart"/>
+      <w:r>
+        <w:t>energy</w:t>
+      </w:r>
+      <w:proofErr w:type="spellEnd"/>
+      <w:r>
+        <w:t xml:space="preserve">-efficient AI </w:t>
+      </w:r>
+      <w:r>
+        <w:lastRenderedPageBreak/>
+        <w:t>hardware. “</w:t>
+      </w:r>
+      <w:r>
+        <w:rPr>
+          <w:b/>
+          <w:bCs/>
+        </w:rPr>
+        <w:t xml:space="preserve">AI </w:t>
+      </w:r>
+      <w:proofErr w:type="spellStart"/>
+      <w:r>
+        <w:rPr>
+          <w:b/>
+          <w:bCs/>
+        </w:rPr>
+        <w:t>changed</w:t>
+      </w:r>
+      <w:proofErr w:type="spellEnd"/>
+      <w:r>
+        <w:rPr>
+          <w:b/>
+          <w:bCs/>
+        </w:rPr>
+        <w:t xml:space="preserve"> the </w:t>
+      </w:r>
+      <w:proofErr w:type="spellStart"/>
+      <w:r>
+        <w:rPr>
+          <w:b/>
+          <w:bCs/>
+        </w:rPr>
+        <w:t>scale</w:t>
+      </w:r>
+      <w:proofErr w:type="spellEnd"/>
+      <w:r>
+        <w:rPr>
+          <w:b/>
+          <w:bCs/>
+        </w:rPr>
+        <w:t xml:space="preserve"> and type of </w:t>
+      </w:r>
+      <w:proofErr w:type="spellStart"/>
+      <w:r>
+        <w:rPr>
+          <w:b/>
+          <w:bCs/>
+        </w:rPr>
+        <w:t>computing</w:t>
+      </w:r>
+      <w:proofErr w:type="spellEnd"/>
+      <w:r>
+        <w:t xml:space="preserve">, and the </w:t>
+      </w:r>
+      <w:proofErr w:type="spellStart"/>
+      <w:r>
+        <w:t>intensity</w:t>
+      </w:r>
+      <w:proofErr w:type="spellEnd"/>
+      <w:r>
+        <w:t xml:space="preserve"> normal people use </w:t>
+      </w:r>
+      <w:proofErr w:type="spellStart"/>
+      <w:r>
+        <w:t>them</w:t>
+      </w:r>
+      <w:proofErr w:type="spellEnd"/>
+      <w:r>
+        <w:t>.”</w:t>
+      </w:r>
+    </w:p>
+    <w:p>
+      <w:pPr>
+        <w:jc w:val="both"/>
+      </w:pPr>
+    </w:p>
+    <w:p>
+      <w:pPr>
+        <w:jc w:val="both"/>
+      </w:pPr>
+      <w:proofErr w:type="gramStart"/>
+      <w:r>
+        <w:t>training</w:t>
+      </w:r>
+      <w:proofErr w:type="gramEnd"/>
+      <w:r>
+        <w:t xml:space="preserve"> </w:t>
+      </w:r>
+      <w:proofErr w:type="gramStart"/>
+      <w:r>
+        <w:t>a</w:t>
+      </w:r>
+      <w:proofErr w:type="gramEnd"/>
+      <w:r>
+        <w:t xml:space="preserve"> large AI model can </w:t>
+      </w:r>
+      <w:proofErr w:type="spellStart"/>
+      <w:r>
+        <w:t>involve</w:t>
+      </w:r>
+      <w:proofErr w:type="spellEnd"/>
+      <w:r>
+        <w:t xml:space="preserve"> </w:t>
+      </w:r>
+      <w:proofErr w:type="spellStart"/>
+      <w:r>
+        <w:t>thousands</w:t>
+      </w:r>
+      <w:proofErr w:type="spellEnd"/>
+      <w:r>
+        <w:t xml:space="preserve"> of </w:t>
+      </w:r>
+      <w:proofErr w:type="spellStart"/>
+      <w:r>
+        <w:rPr>
+          <w:b/>
+          <w:bCs/>
+        </w:rPr>
+        <w:t>specialized</w:t>
+      </w:r>
+      <w:proofErr w:type="spellEnd"/>
+      <w:r>
+        <w:rPr>
+          <w:b/>
+          <w:bCs/>
+        </w:rPr>
+        <w:t xml:space="preserve"> processors </w:t>
+      </w:r>
+      <w:r>
+        <w:t xml:space="preserve">operating </w:t>
+      </w:r>
+      <w:proofErr w:type="spellStart"/>
+      <w:r>
+        <w:t>together</w:t>
+      </w:r>
+      <w:proofErr w:type="spellEnd"/>
+      <w:r>
+        <w:t xml:space="preserve"> for an </w:t>
+      </w:r>
+      <w:proofErr w:type="spellStart"/>
+      <w:r>
+        <w:t>extended</w:t>
+      </w:r>
+      <w:proofErr w:type="spellEnd"/>
+      <w:r>
+        <w:t xml:space="preserve"> </w:t>
+      </w:r>
+      <w:proofErr w:type="spellStart"/>
+      <w:r>
+        <w:t>period</w:t>
+      </w:r>
+      <w:proofErr w:type="spellEnd"/>
+      <w:r>
+        <w:t xml:space="preserve">. He </w:t>
+      </w:r>
+      <w:proofErr w:type="spellStart"/>
+      <w:r>
+        <w:t>also</w:t>
+      </w:r>
+      <w:proofErr w:type="spellEnd"/>
+      <w:r>
+        <w:t xml:space="preserve"> </w:t>
+      </w:r>
+      <w:proofErr w:type="spellStart"/>
+      <w:r>
+        <w:t>said</w:t>
+      </w:r>
+      <w:proofErr w:type="spellEnd"/>
+      <w:r>
+        <w:t xml:space="preserve"> </w:t>
+      </w:r>
+      <w:proofErr w:type="spellStart"/>
+      <w:r>
+        <w:t>that</w:t>
+      </w:r>
+      <w:proofErr w:type="spellEnd"/>
+      <w:r>
+        <w:t xml:space="preserve"> </w:t>
+      </w:r>
+      <w:proofErr w:type="spellStart"/>
+      <w:r>
+        <w:t>when</w:t>
+      </w:r>
+      <w:proofErr w:type="spellEnd"/>
+      <w:r>
+        <w:t xml:space="preserve"> large </w:t>
+      </w:r>
+      <w:proofErr w:type="spellStart"/>
+      <w:r>
+        <w:t>numbers</w:t>
+      </w:r>
+      <w:proofErr w:type="spellEnd"/>
+      <w:r>
+        <w:t xml:space="preserve"> of people </w:t>
+      </w:r>
+      <w:proofErr w:type="spellStart"/>
+      <w:r>
+        <w:t>send</w:t>
+      </w:r>
+      <w:proofErr w:type="spellEnd"/>
+      <w:r>
+        <w:t xml:space="preserve"> </w:t>
+      </w:r>
+      <w:proofErr w:type="spellStart"/>
+      <w:r>
+        <w:t>requests</w:t>
+      </w:r>
+      <w:proofErr w:type="spellEnd"/>
+      <w:r>
+        <w:t xml:space="preserve"> to an AI system and </w:t>
+      </w:r>
+      <w:proofErr w:type="spellStart"/>
+      <w:r>
+        <w:t>expect</w:t>
+      </w:r>
+      <w:proofErr w:type="spellEnd"/>
+      <w:r>
+        <w:t xml:space="preserve"> </w:t>
+      </w:r>
+      <w:proofErr w:type="spellStart"/>
+      <w:r>
+        <w:t>immediate</w:t>
+      </w:r>
+      <w:proofErr w:type="spellEnd"/>
+      <w:r>
+        <w:t xml:space="preserve"> </w:t>
+      </w:r>
+      <w:proofErr w:type="spellStart"/>
+      <w:r>
+        <w:t>responses</w:t>
+      </w:r>
+      <w:proofErr w:type="spellEnd"/>
+      <w:r>
+        <w:t xml:space="preserve">, </w:t>
+      </w:r>
+      <w:proofErr w:type="spellStart"/>
+      <w:r>
+        <w:t>it</w:t>
+      </w:r>
+      <w:proofErr w:type="spellEnd"/>
+      <w:r>
+        <w:t xml:space="preserve"> </w:t>
+      </w:r>
+      <w:proofErr w:type="spellStart"/>
+      <w:r>
+        <w:t>requires</w:t>
+      </w:r>
+      <w:proofErr w:type="spellEnd"/>
+      <w:r>
+        <w:t xml:space="preserve"> </w:t>
+      </w:r>
+      <w:proofErr w:type="spellStart"/>
+      <w:r>
+        <w:t>substantial</w:t>
+      </w:r>
+      <w:proofErr w:type="spellEnd"/>
+      <w:r>
+        <w:t xml:space="preserve"> </w:t>
+      </w:r>
+      <w:proofErr w:type="spellStart"/>
+      <w:r>
+        <w:t>computing</w:t>
+      </w:r>
+      <w:proofErr w:type="spellEnd"/>
+      <w:r>
+        <w:t xml:space="preserve"> power.</w:t>
+      </w:r>
+    </w:p>
+    <w:p>
+      <w:pPr>
+        <w:jc w:val="both"/>
+      </w:pPr>
+    </w:p>
+    <w:p>
+      <w:pPr>
+        <w:jc w:val="both"/>
+      </w:pPr>
+      <w:r>
+        <w:t xml:space="preserve">Data center supporters </w:t>
+      </w:r>
+      <w:proofErr w:type="spellStart"/>
+      <w:r>
+        <w:t>say</w:t>
+      </w:r>
+      <w:proofErr w:type="spellEnd"/>
+      <w:r>
+        <w:t xml:space="preserve"> the </w:t>
+      </w:r>
+      <w:proofErr w:type="spellStart"/>
+      <w:r>
+        <w:t>facilities</w:t>
+      </w:r>
+      <w:proofErr w:type="spellEnd"/>
+      <w:r>
+        <w:t xml:space="preserve"> </w:t>
+      </w:r>
+      <w:r>
+        <w:rPr>
+          <w:b/>
+          <w:bCs/>
+        </w:rPr>
+        <w:t>can </w:t>
+      </w:r>
+      <w:proofErr w:type="spellStart"/>
+      <w:r>
+        <w:rPr>
+          <w:b/>
+          <w:bCs/>
+        </w:rPr>
+        <w:fldChar w:fldCharType="begin"/>
+      </w:r>
+      <w:r>
+        <w:rPr>
+          <w:b/>
+          <w:bCs/>
+        </w:rPr>
+        <w:instrText>HYPERLINK "https://www.wri.org/insights/us-data-center-growth-impacts"</w:instrText>
+      </w:r>
+      <w:r>
+        <w:rPr>
+          <w:b/>
+          <w:bCs/>
+        </w:rPr>
+      </w:r>
+      <w:r>
+        <w:rPr>
+          <w:b/>
+          <w:bCs/>
+        </w:rPr>
+        <w:fldChar w:fldCharType="separate"/>
+      </w:r>
+      <w:r>
+        <w:rPr>
+          <w:rStyle w:val="Lienhypertexte"/>
+          <w:b/>
+          <w:bCs/>
+        </w:rPr>
+        <w:t>create</w:t>
+      </w:r>
+      <w:proofErr w:type="spellEnd"/>
+      <w:r>
+        <w:rPr>
+          <w:b/>
+          <w:bCs/>
+        </w:rPr>
+        <w:fldChar w:fldCharType="end"/>
+      </w:r>
+      <w:r>
+        <w:rPr>
+          <w:b/>
+          <w:bCs/>
+        </w:rPr>
+        <w:t> </w:t>
+      </w:r>
+      <w:proofErr w:type="spellStart"/>
+      <w:r>
+        <w:rPr>
+          <w:b/>
+          <w:bCs/>
+        </w:rPr>
+        <w:t>temporary</w:t>
+      </w:r>
+      <w:proofErr w:type="spellEnd"/>
+      <w:r>
+        <w:rPr>
+          <w:b/>
+          <w:bCs/>
+        </w:rPr>
+        <w:t xml:space="preserve"> jobs for construction </w:t>
+      </w:r>
+      <w:proofErr w:type="spellStart"/>
+      <w:r>
+        <w:rPr>
+          <w:b/>
+          <w:bCs/>
+        </w:rPr>
+        <w:t>workers</w:t>
+      </w:r>
+      <w:proofErr w:type="spellEnd"/>
+      <w:r>
+        <w:rPr>
+          <w:b/>
+          <w:bCs/>
+        </w:rPr>
+        <w:t xml:space="preserve"> and </w:t>
+      </w:r>
+      <w:proofErr w:type="spellStart"/>
+      <w:r>
+        <w:rPr>
+          <w:b/>
+          <w:bCs/>
+        </w:rPr>
+        <w:t>electricians</w:t>
+      </w:r>
+      <w:proofErr w:type="spellEnd"/>
+      <w:r>
+        <w:rPr>
+          <w:b/>
+          <w:bCs/>
+        </w:rPr>
+        <w:t xml:space="preserve"> and full-time </w:t>
+      </w:r>
+      <w:proofErr w:type="spellStart"/>
+      <w:r>
+        <w:rPr>
+          <w:b/>
+          <w:bCs/>
+        </w:rPr>
+        <w:t>employment</w:t>
+      </w:r>
+      <w:proofErr w:type="spellEnd"/>
+      <w:r>
+        <w:rPr>
+          <w:b/>
+          <w:bCs/>
+        </w:rPr>
+        <w:t xml:space="preserve"> for </w:t>
+      </w:r>
+      <w:proofErr w:type="spellStart"/>
+      <w:r>
+        <w:rPr>
+          <w:b/>
+          <w:bCs/>
+        </w:rPr>
+        <w:t>technicians</w:t>
+      </w:r>
+      <w:proofErr w:type="spellEnd"/>
+      <w:r>
+        <w:t xml:space="preserve">, </w:t>
+      </w:r>
+      <w:proofErr w:type="spellStart"/>
+      <w:r>
+        <w:t>security</w:t>
+      </w:r>
+      <w:proofErr w:type="spellEnd"/>
+      <w:r>
+        <w:t xml:space="preserve"> staff and </w:t>
+      </w:r>
+      <w:proofErr w:type="spellStart"/>
+      <w:r>
+        <w:t>facility</w:t>
+      </w:r>
+      <w:proofErr w:type="spellEnd"/>
+      <w:r>
+        <w:t xml:space="preserve"> managers. The </w:t>
+      </w:r>
+      <w:proofErr w:type="spellStart"/>
+      <w:r>
+        <w:t>facilities</w:t>
+      </w:r>
+      <w:proofErr w:type="spellEnd"/>
+      <w:r>
+        <w:t xml:space="preserve"> </w:t>
+      </w:r>
+      <w:proofErr w:type="spellStart"/>
+      <w:r>
+        <w:t>also</w:t>
+      </w:r>
+      <w:proofErr w:type="spellEnd"/>
+      <w:r>
+        <w:t> </w:t>
+      </w:r>
+      <w:proofErr w:type="spellStart"/>
+      <w:r>
+        <w:fldChar w:fldCharType="begin"/>
+      </w:r>
+      <w:r>
+        <w:instrText>HYPERLINK "https://www.brookings.edu/articles/turning-the-data-center-boom-into-long-term-local-prosperity/"</w:instrText>
+      </w:r>
+      <w:r>
+        <w:fldChar w:fldCharType="separate"/>
+      </w:r>
+      <w:r>
+        <w:rPr>
+          <w:rStyle w:val="Lienhypertexte"/>
+        </w:rPr>
+        <w:t>generate</w:t>
+      </w:r>
+      <w:proofErr w:type="spellEnd"/>
+      <w:r>
+        <w:fldChar w:fldCharType="end"/>
+      </w:r>
+      <w:r>
+        <w:t xml:space="preserve"> revenue for local or state </w:t>
+      </w:r>
+      <w:proofErr w:type="spellStart"/>
+      <w:r>
+        <w:t>governments</w:t>
+      </w:r>
+      <w:proofErr w:type="spellEnd"/>
+      <w:r>
+        <w:t xml:space="preserve"> </w:t>
+      </w:r>
+      <w:proofErr w:type="spellStart"/>
+      <w:r>
+        <w:t>through</w:t>
+      </w:r>
+      <w:proofErr w:type="spellEnd"/>
+      <w:r>
+        <w:t xml:space="preserve"> </w:t>
+      </w:r>
+      <w:proofErr w:type="spellStart"/>
+      <w:r>
+        <w:t>property</w:t>
+      </w:r>
+      <w:proofErr w:type="spellEnd"/>
+      <w:r>
+        <w:t>, sales and use taxes.</w:t>
+      </w:r>
+    </w:p>
+    <w:p>
+      <w:pPr>
+        <w:jc w:val="both"/>
+      </w:pPr>
+    </w:p>
+    <w:p>
+      <w:pPr>
+        <w:jc w:val="both"/>
+      </w:pPr>
+      <w:proofErr w:type="spellStart"/>
+      <w:r>
+        <w:rPr>
+          <w:b/>
+          <w:bCs/>
+        </w:rPr>
+        <w:t>Residential</w:t>
+      </w:r>
+      <w:proofErr w:type="spellEnd"/>
+      <w:r>
+        <w:rPr>
+          <w:b/>
+          <w:bCs/>
+        </w:rPr>
+        <w:t xml:space="preserve"> </w:t>
+      </w:r>
+      <w:proofErr w:type="spellStart"/>
+      <w:r>
+        <w:rPr>
+          <w:b/>
+          <w:bCs/>
+        </w:rPr>
+        <w:t>electricity</w:t>
+      </w:r>
+      <w:proofErr w:type="spellEnd"/>
+      <w:r>
+        <w:rPr>
+          <w:b/>
+          <w:bCs/>
+        </w:rPr>
+        <w:t xml:space="preserve"> </w:t>
+      </w:r>
+      <w:proofErr w:type="spellStart"/>
+      <w:r>
+        <w:rPr>
+          <w:b/>
+          <w:bCs/>
+        </w:rPr>
+        <w:t>prices</w:t>
+      </w:r>
+      <w:proofErr w:type="spellEnd"/>
+      <w:r>
+        <w:rPr>
+          <w:b/>
+          <w:bCs/>
+        </w:rPr>
+        <w:t xml:space="preserve"> have </w:t>
+      </w:r>
+      <w:proofErr w:type="spellStart"/>
+      <w:r>
+        <w:rPr>
+          <w:b/>
+          <w:bCs/>
+        </w:rPr>
+        <w:fldChar w:fldCharType="begin"/>
+      </w:r>
+      <w:r>
+        <w:rPr>
+          <w:b/>
+          <w:bCs/>
+        </w:rPr>
+        <w:instrText>HYPERLINK "https://politifact.com/factchecks/2026/jun/12/elizabeth-warren/data-centers-rising-electricity-costs/"</w:instrText>
+      </w:r>
+      <w:r>
+        <w:rPr>
+          <w:b/>
+          <w:bCs/>
+        </w:rPr>
+      </w:r>
+      <w:r>
+        <w:rPr>
+          <w:b/>
+          <w:bCs/>
+        </w:rPr>
+        <w:fldChar w:fldCharType="separate"/>
+      </w:r>
+      <w:r>
+        <w:rPr>
+          <w:rStyle w:val="Lienhypertexte"/>
+          <w:b/>
+          <w:bCs/>
+        </w:rPr>
+        <w:t>risen</w:t>
+      </w:r>
+      <w:proofErr w:type="spellEnd"/>
+      <w:r>
+        <w:rPr>
+          <w:b/>
+          <w:bCs/>
+        </w:rPr>
+        <w:fldChar w:fldCharType="end"/>
+      </w:r>
+      <w:r>
+        <w:rPr>
+          <w:b/>
+          <w:bCs/>
+        </w:rPr>
+        <w:t xml:space="preserve"> in the last five </w:t>
+      </w:r>
+      <w:proofErr w:type="spellStart"/>
+      <w:r>
+        <w:rPr>
+          <w:b/>
+          <w:bCs/>
+        </w:rPr>
+        <w:t>years</w:t>
+      </w:r>
+      <w:proofErr w:type="spellEnd"/>
+      <w:r>
+        <w:t xml:space="preserve">, and data center </w:t>
+      </w:r>
+      <w:proofErr w:type="spellStart"/>
+      <w:r>
+        <w:t>demand</w:t>
+      </w:r>
+      <w:proofErr w:type="spellEnd"/>
+      <w:r>
+        <w:t xml:space="preserve"> </w:t>
+      </w:r>
+      <w:proofErr w:type="spellStart"/>
+      <w:r>
+        <w:t>is</w:t>
+      </w:r>
+      <w:proofErr w:type="spellEnd"/>
+      <w:r>
+        <w:t xml:space="preserve"> a big driver in </w:t>
+      </w:r>
+      <w:proofErr w:type="spellStart"/>
+      <w:r>
+        <w:t>some</w:t>
+      </w:r>
+      <w:proofErr w:type="spellEnd"/>
+      <w:r>
+        <w:t xml:space="preserve"> areas.</w:t>
+      </w:r>
+    </w:p>
+    <w:p>
+      <w:pPr>
+        <w:jc w:val="both"/>
+      </w:pPr>
+    </w:p>
+    <w:p>
+      <w:pPr>
+        <w:jc w:val="both"/>
+      </w:pPr>
+      <w:r>
+        <w:t>Infrastructure: 1. Steel Concrete,2. Aluminium, 3. Copper (</w:t>
+      </w:r>
+      <w:proofErr w:type="spellStart"/>
+      <w:r>
+        <w:t>electrical</w:t>
+      </w:r>
+      <w:proofErr w:type="spellEnd"/>
+      <w:r>
+        <w:t xml:space="preserve"> system).</w:t>
+      </w:r>
+    </w:p>
+    <w:p>
+      <w:pPr>
+        <w:jc w:val="both"/>
+        <w:rPr>
+          <w:b/>
+          <w:bCs/>
+        </w:rPr>
+      </w:pPr>
+      <w:r>
+        <w:rPr>
+          <w:b/>
+          <w:bCs/>
+        </w:rPr>
+        <w:t xml:space="preserve">Construction versus </w:t>
+      </w:r>
+      <w:proofErr w:type="spellStart"/>
+      <w:r>
+        <w:rPr>
+          <w:b/>
+          <w:bCs/>
+        </w:rPr>
+        <w:t>operational</w:t>
+      </w:r>
+      <w:proofErr w:type="spellEnd"/>
+      <w:r>
+        <w:rPr>
+          <w:b/>
+          <w:bCs/>
+        </w:rPr>
+        <w:t xml:space="preserve"> jobs </w:t>
+      </w:r>
+      <w:proofErr w:type="spellStart"/>
+      <w:r>
+        <w:rPr>
+          <w:b/>
+          <w:bCs/>
+        </w:rPr>
+        <w:t>from</w:t>
+      </w:r>
+      <w:proofErr w:type="spellEnd"/>
+      <w:r>
+        <w:rPr>
+          <w:b/>
+          <w:bCs/>
+        </w:rPr>
+        <w:t xml:space="preserve"> data center </w:t>
+      </w:r>
+      <w:proofErr w:type="spellStart"/>
+      <w:r>
+        <w:rPr>
+          <w:b/>
+          <w:bCs/>
+        </w:rPr>
+        <w:t>development</w:t>
+      </w:r>
+      <w:proofErr w:type="spellEnd"/>
+    </w:p>
+    <w:tbl>
+      <w:tblPr>
+        <w:tblW w:w="9840" w:type="dxa"/>
+        <w:tblCellSpacing w:w="0" w:type="dxa"/>
+        <w:tblCellMar>
+          <w:top w:w="15" w:type="dxa"/>
+          <w:left w:w="15" w:type="dxa"/>
+          <w:bottom w:w="15" w:type="dxa"/>
+          <w:right w:w="15" w:type="dxa"/>
+        </w:tblCellMar>
+        <w:tblLook w:val="04A0" w:firstRow="1" w:lastRow="0" w:firstColumn="1" w:lastColumn="0" w:noHBand="0" w:noVBand="1"/>
+      </w:tblPr>
+      <w:tblGrid>
+        <w:gridCol w:w="3974"/>
+        <w:gridCol w:w="3472"/>
+        <w:gridCol w:w="2394"/>
+      </w:tblGrid>
+      <w:tr>
+        <w:trPr>
+          <w:tblHeader/>
+          <w:tblCellSpacing w:w="0" w:type="dxa"/>
+        </w:trPr>
+        <w:tc>
+          <w:tcPr>
+            <w:tcW w:w="0" w:type="auto"/>
+            <w:gridSpan w:val="3"/>
+            <w:tcBorders>
+              <w:top w:val="nil"/>
+              <w:left w:val="nil"/>
+              <w:bottom w:val="nil"/>
+              <w:right w:val="nil"/>
+            </w:tcBorders>
+            <w:vAlign w:val="center"/>
+            <w:hideMark/>
+          </w:tcPr>
+          <w:p/>
+        </w:tc>
+      </w:tr>
+      <w:tr>
+        <w:trPr>
+          <w:tblHeader/>
+          <w:tblCellSpacing w:w="0" w:type="dxa"/>
+        </w:trPr>
+        <w:tc>
+          <w:tcPr>
+            <w:tcW w:w="2198" w:type="dxa"/>
+            <w:tcBorders>
+              <w:bottom w:val="single" w:sz="12" w:space="0" w:color="333333"/>
+            </w:tcBorders>
+            <w:vAlign w:val="bottom"/>
+            <w:hideMark/>
+          </w:tcPr>
+          <w:p>
+            <w:pPr>
+              <w:rPr>
+                <w:b/>
+                <w:bCs/>
+              </w:rPr>
+            </w:pPr>
+            <w:r>
+              <w:rPr>
+                <w:b/>
+                <w:bCs/>
+              </w:rPr>
+              <w:t>Study</w:t>
+            </w:r>
+          </w:p>
+        </w:tc>
+        <w:tc>
+          <w:tcPr>
+            <w:tcW w:w="0" w:type="auto"/>
+            <w:tcBorders>
+              <w:left w:val="nil"/>
+              <w:bottom w:val="single" w:sz="12" w:space="0" w:color="333333"/>
+            </w:tcBorders>
+            <w:tcMar>
+              <w:top w:w="120" w:type="dxa"/>
+              <w:left w:w="240" w:type="dxa"/>
+              <w:bottom w:w="120" w:type="dxa"/>
+              <w:right w:w="240" w:type="dxa"/>
+            </w:tcMar>
+            <w:vAlign w:val="bottom"/>
+            <w:hideMark/>
+          </w:tcPr>
+          <w:p>
+            <w:pPr>
+              <w:rPr>
+                <w:b/>
+                <w:bCs/>
+              </w:rPr>
+            </w:pPr>
+            <w:r>
+              <w:rPr>
+                <w:b/>
+                <w:bCs/>
+              </w:rPr>
+              <w:t>Construction Jobs (one-time)</w:t>
+            </w:r>
+          </w:p>
+        </w:tc>
+        <w:tc>
+          <w:tcPr>
+            <w:tcW w:w="0" w:type="auto"/>
+            <w:tcBorders>
+              <w:left w:val="nil"/>
+              <w:bottom w:val="single" w:sz="12" w:space="0" w:color="333333"/>
+            </w:tcBorders>
+            <w:vAlign w:val="bottom"/>
+            <w:hideMark/>
+          </w:tcPr>
+          <w:p>
+            <w:pPr>
+              <w:rPr>
+                <w:b/>
+                <w:bCs/>
+              </w:rPr>
+            </w:pPr>
+            <w:proofErr w:type="spellStart"/>
+            <w:r>
+              <w:rPr>
+                <w:b/>
+                <w:bCs/>
+              </w:rPr>
+              <w:t>Operational</w:t>
+            </w:r>
+            <w:proofErr w:type="spellEnd"/>
+            <w:r>
+              <w:rPr>
+                <w:b/>
+                <w:bCs/>
+              </w:rPr>
+              <w:t xml:space="preserve"> Jobs (</w:t>
+            </w:r>
+            <w:proofErr w:type="spellStart"/>
+            <w:r>
+              <w:rPr>
+                <w:b/>
+                <w:bCs/>
+              </w:rPr>
+              <w:t>ongoing</w:t>
+            </w:r>
+            <w:proofErr w:type="spellEnd"/>
+            <w:r>
+              <w:rPr>
+                <w:b/>
+                <w:bCs/>
+              </w:rPr>
+              <w:t>)</w:t>
+            </w:r>
+          </w:p>
+        </w:tc>
+      </w:tr>
+      <w:tr>
+        <w:trPr>
+          <w:tblCellSpacing w:w="0" w:type="dxa"/>
+        </w:trPr>
+        <w:tc>
+          <w:tcPr>
+            <w:tcW w:w="2198" w:type="dxa"/>
+            <w:vAlign w:val="center"/>
+            <w:hideMark/>
+          </w:tcPr>
+          <w:p>
+            <w:pPr>
+              <w:rPr>
+                <w:b/>
+                <w:bCs/>
+              </w:rPr>
+            </w:pPr>
+            <w:r>
+              <w:rPr>
+                <w:b/>
+                <w:bCs/>
+              </w:rPr>
+              <w:t>PwC (2023)</w:t>
+            </w:r>
+          </w:p>
+        </w:tc>
+        <w:tc>
+          <w:tcPr>
+            <w:tcW w:w="960" w:type="dxa"/>
+            <w:tcBorders>
+              <w:left w:val="nil"/>
+            </w:tcBorders>
+            <w:tcMar>
+              <w:top w:w="150" w:type="dxa"/>
+              <w:left w:w="240" w:type="dxa"/>
+              <w:bottom w:w="150" w:type="dxa"/>
+              <w:right w:w="240" w:type="dxa"/>
+            </w:tcMar>
+            <w:vAlign w:val="center"/>
+            <w:hideMark/>
+          </w:tcPr>
+          <w:p>
+            <w:r>
+              <w:t>1,000–10,000</w:t>
+            </w:r>
+          </w:p>
+        </w:tc>
+        <w:tc>
+          <w:tcPr>
+            <w:tcW w:w="960" w:type="dxa"/>
+            <w:tcBorders>
+              <w:left w:val="nil"/>
+            </w:tcBorders>
+            <w:vAlign w:val="center"/>
+            <w:hideMark/>
+          </w:tcPr>
+          <w:p>
+            <w:r>
+              <w:t>50–300</w:t>
+            </w:r>
+          </w:p>
+        </w:tc>
+      </w:tr>
+      <w:tr>
+        <w:trPr>
+          <w:tblCellSpacing w:w="0" w:type="dxa"/>
+        </w:trPr>
+        <w:tc>
+          <w:tcPr>
+            <w:tcW w:w="2198" w:type="dxa"/>
+            <w:vAlign w:val="center"/>
+            <w:hideMark/>
+          </w:tcPr>
+          <w:p>
+            <w:pPr>
+              <w:rPr>
+                <w:b/>
+                <w:bCs/>
+              </w:rPr>
+            </w:pPr>
+            <w:r>
+              <w:rPr>
+                <w:b/>
+                <w:bCs/>
+              </w:rPr>
+              <w:t>JLARC (2024)</w:t>
+            </w:r>
+          </w:p>
+        </w:tc>
+        <w:tc>
+          <w:tcPr>
+            <w:tcW w:w="960" w:type="dxa"/>
+            <w:tcBorders>
+              <w:left w:val="nil"/>
+            </w:tcBorders>
+            <w:tcMar>
+              <w:top w:w="150" w:type="dxa"/>
+              <w:left w:w="240" w:type="dxa"/>
+              <w:bottom w:w="150" w:type="dxa"/>
+              <w:right w:w="240" w:type="dxa"/>
+            </w:tcMar>
+            <w:vAlign w:val="center"/>
+            <w:hideMark/>
+          </w:tcPr>
+          <w:p>
+            <w:r>
+              <w:t>3,000–5,000</w:t>
+            </w:r>
+          </w:p>
+        </w:tc>
+        <w:tc>
+          <w:tcPr>
+            <w:tcW w:w="960" w:type="dxa"/>
+            <w:tcBorders>
+              <w:left w:val="nil"/>
+            </w:tcBorders>
+            <w:vAlign w:val="center"/>
+            <w:hideMark/>
+          </w:tcPr>
+          <w:p>
+            <w:r>
+              <w:t>100–400</w:t>
+            </w:r>
+          </w:p>
+        </w:tc>
+      </w:tr>
+      <w:tr>
+        <w:trPr>
+          <w:tblCellSpacing w:w="0" w:type="dxa"/>
+        </w:trPr>
+        <w:tc>
+          <w:tcPr>
+            <w:tcW w:w="2198" w:type="dxa"/>
+            <w:vAlign w:val="center"/>
+            <w:hideMark/>
+          </w:tcPr>
+          <w:p>
+            <w:pPr>
+              <w:rPr>
+                <w:b/>
+                <w:bCs/>
+              </w:rPr>
+            </w:pPr>
+            <w:r>
+              <w:rPr>
+                <w:b/>
+                <w:bCs/>
+              </w:rPr>
+              <w:t>Sage Policy (2024)</w:t>
+            </w:r>
+          </w:p>
+        </w:tc>
+        <w:tc>
+          <w:tcPr>
+            <w:tcW w:w="960" w:type="dxa"/>
+            <w:tcBorders>
+              <w:left w:val="nil"/>
+            </w:tcBorders>
+            <w:tcMar>
+              <w:top w:w="150" w:type="dxa"/>
+              <w:left w:w="240" w:type="dxa"/>
+              <w:bottom w:w="150" w:type="dxa"/>
+              <w:right w:w="240" w:type="dxa"/>
+            </w:tcMar>
+            <w:vAlign w:val="center"/>
+            <w:hideMark/>
+          </w:tcPr>
+          <w:p>
+            <w:r>
+              <w:t>~2,000</w:t>
+            </w:r>
+          </w:p>
+        </w:tc>
+        <w:tc>
+          <w:tcPr>
+            <w:tcW w:w="960" w:type="dxa"/>
+            <w:tcBorders>
+              <w:left w:val="nil"/>
+            </w:tcBorders>
+            <w:vAlign w:val="center"/>
+            <w:hideMark/>
+          </w:tcPr>
+          <w:p>
+            <w:r>
+              <w:t>~200</w:t>
+            </w:r>
+          </w:p>
+        </w:tc>
+      </w:tr>
+      <w:tr>
+        <w:trPr>
+          <w:tblCellSpacing w:w="0" w:type="dxa"/>
+        </w:trPr>
+        <w:tc>
+          <w:tcPr>
+            <w:tcW w:w="2198" w:type="dxa"/>
+            <w:vAlign w:val="center"/>
+            <w:hideMark/>
+          </w:tcPr>
+          <w:p>
+            <w:pPr>
+              <w:rPr>
+                <w:b/>
+                <w:bCs/>
+              </w:rPr>
+            </w:pPr>
+            <w:r>
+              <w:rPr>
+                <w:b/>
+                <w:bCs/>
+              </w:rPr>
+              <w:t>Thompson (2019)</w:t>
+            </w:r>
+          </w:p>
+        </w:tc>
+        <w:tc>
+          <w:tcPr>
+            <w:tcW w:w="960" w:type="dxa"/>
+            <w:tcBorders>
+              <w:left w:val="nil"/>
+            </w:tcBorders>
+            <w:tcMar>
+              <w:top w:w="150" w:type="dxa"/>
+              <w:left w:w="240" w:type="dxa"/>
+              <w:bottom w:w="150" w:type="dxa"/>
+              <w:right w:w="240" w:type="dxa"/>
+            </w:tcMar>
+            <w:vAlign w:val="center"/>
+            <w:hideMark/>
+          </w:tcPr>
+          <w:p>
+            <w:r>
+              <w:t>~1,200</w:t>
+            </w:r>
+          </w:p>
+        </w:tc>
+        <w:tc>
+          <w:tcPr>
+            <w:tcW w:w="960" w:type="dxa"/>
+            <w:tcBorders>
+              <w:left w:val="nil"/>
+            </w:tcBorders>
+            <w:vAlign w:val="center"/>
+            <w:hideMark/>
+          </w:tcPr>
+          <w:p>
+            <w:r>
+              <w:t>100–150</w:t>
+            </w:r>
+          </w:p>
+        </w:tc>
+      </w:tr>
+      <w:tr>
+        <w:trPr>
+          <w:tblCellSpacing w:w="0" w:type="dxa"/>
+        </w:trPr>
+        <w:tc>
+          <w:tcPr>
+            <w:tcW w:w="2198" w:type="dxa"/>
+            <w:vAlign w:val="center"/>
+            <w:hideMark/>
+          </w:tcPr>
+          <w:p>
+            <w:pPr>
+              <w:rPr>
+                <w:b/>
+                <w:bCs/>
+              </w:rPr>
+            </w:pPr>
+            <w:r>
+              <w:rPr>
+                <w:b/>
+                <w:bCs/>
+              </w:rPr>
+              <w:t>Morrow County (2024)</w:t>
+            </w:r>
+          </w:p>
+        </w:tc>
+        <w:tc>
+          <w:tcPr>
+            <w:tcW w:w="960" w:type="dxa"/>
+            <w:tcBorders>
+              <w:left w:val="nil"/>
+            </w:tcBorders>
+            <w:tcMar>
+              <w:top w:w="150" w:type="dxa"/>
+              <w:left w:w="240" w:type="dxa"/>
+              <w:bottom w:w="150" w:type="dxa"/>
+              <w:right w:w="240" w:type="dxa"/>
+            </w:tcMar>
+            <w:vAlign w:val="center"/>
+            <w:hideMark/>
+          </w:tcPr>
+          <w:p>
+            <w:r>
+              <w:t>~1,500</w:t>
+            </w:r>
+          </w:p>
+        </w:tc>
+        <w:tc>
+          <w:tcPr>
+            <w:tcW w:w="960" w:type="dxa"/>
+            <w:tcBorders>
+              <w:left w:val="nil"/>
+            </w:tcBorders>
+            <w:vAlign w:val="center"/>
+            <w:hideMark/>
+          </w:tcPr>
+          <w:p>
+            <w:r>
+              <w:t>80–120</w:t>
+            </w:r>
+          </w:p>
+        </w:tc>
+      </w:tr>
+    </w:tbl>
+    <w:p/>
+    <w:p/>
+    <w:p/>
+    <w:p>
+      <w:pPr>
+        <w:pStyle w:val="Paragraphedeliste"/>
+        <w:numPr>
+          <w:ilvl w:val="0"/>
+          <w:numId w:val="3"/>
+        </w:numPr>
+        <w:rPr>
+          <w:b/>
+          <w:bCs/>
+        </w:rPr>
+      </w:pPr>
+      <w:r>
+        <w:rPr>
+          <w:b/>
+          <w:bCs/>
+        </w:rPr>
+        <w:t>Données générales et historique.</w:t>
+      </w:r>
+    </w:p>
+    <w:p>
+      <w:hyperlink r:id="rId14" w:history="1">
+        <w:proofErr w:type="spellStart"/>
+        <w:r>
+          <w:rPr>
+            <w:rStyle w:val="Lienhypertexte"/>
+          </w:rPr>
+          <w:t>What</w:t>
+        </w:r>
+        <w:proofErr w:type="spellEnd"/>
+        <w:r>
+          <w:rPr>
+            <w:rStyle w:val="Lienhypertexte"/>
+          </w:rPr>
+          <w:t xml:space="preserve"> are data centers? </w:t>
+        </w:r>
+        <w:proofErr w:type="spellStart"/>
+        <w:r>
+          <w:rPr>
+            <w:rStyle w:val="Lienhypertexte"/>
+          </w:rPr>
+          <w:t>Here’s</w:t>
+        </w:r>
+        <w:proofErr w:type="spellEnd"/>
+        <w:r>
+          <w:rPr>
+            <w:rStyle w:val="Lienhypertexte"/>
+          </w:rPr>
+          <w:t xml:space="preserve"> how </w:t>
+        </w:r>
+        <w:proofErr w:type="spellStart"/>
+        <w:r>
+          <w:rPr>
+            <w:rStyle w:val="Lienhypertexte"/>
+          </w:rPr>
+          <w:t>they</w:t>
+        </w:r>
+        <w:proofErr w:type="spellEnd"/>
+        <w:r>
+          <w:rPr>
+            <w:rStyle w:val="Lienhypertexte"/>
+          </w:rPr>
+          <w:t xml:space="preserve"> </w:t>
+        </w:r>
+        <w:proofErr w:type="spellStart"/>
+        <w:r>
+          <w:rPr>
+            <w:rStyle w:val="Lienhypertexte"/>
+          </w:rPr>
+          <w:t>work</w:t>
+        </w:r>
+        <w:proofErr w:type="spellEnd"/>
+        <w:r>
+          <w:rPr>
+            <w:rStyle w:val="Lienhypertexte"/>
+          </w:rPr>
+          <w:t xml:space="preserve"> and </w:t>
+        </w:r>
+        <w:proofErr w:type="spellStart"/>
+        <w:r>
+          <w:rPr>
+            <w:rStyle w:val="Lienhypertexte"/>
+          </w:rPr>
+          <w:t>why</w:t>
+        </w:r>
+        <w:proofErr w:type="spellEnd"/>
+        <w:r>
+          <w:rPr>
+            <w:rStyle w:val="Lienhypertexte"/>
+          </w:rPr>
+          <w:t xml:space="preserve"> </w:t>
+        </w:r>
+        <w:proofErr w:type="spellStart"/>
+        <w:r>
+          <w:rPr>
+            <w:rStyle w:val="Lienhypertexte"/>
+          </w:rPr>
+          <w:t>they</w:t>
+        </w:r>
+        <w:proofErr w:type="spellEnd"/>
+        <w:r>
+          <w:rPr>
+            <w:rStyle w:val="Lienhypertexte"/>
+          </w:rPr>
+          <w:t xml:space="preserve"> </w:t>
+        </w:r>
+        <w:proofErr w:type="spellStart"/>
+        <w:r>
+          <w:rPr>
+            <w:rStyle w:val="Lienhypertexte"/>
+          </w:rPr>
+          <w:t>matter</w:t>
+        </w:r>
+        <w:proofErr w:type="spellEnd"/>
+        <w:r>
+          <w:rPr>
+            <w:rStyle w:val="Lienhypertexte"/>
+          </w:rPr>
+          <w:t xml:space="preserve"> - Poynter</w:t>
+        </w:r>
+      </w:hyperlink>
+    </w:p>
+    <w:p>
+      <w:pPr>
+        <w:pStyle w:val="Paragraphedeliste"/>
+        <w:numPr>
+          <w:ilvl w:val="0"/>
+          <w:numId w:val="3"/>
+        </w:numPr>
+        <w:rPr>
+          <w:b/>
+          <w:bCs/>
+        </w:rPr>
+      </w:pPr>
+      <w:r>
+        <w:rPr>
+          <w:b/>
+          <w:bCs/>
+        </w:rPr>
+        <w:t>Infrastructures</w:t>
+      </w:r>
+    </w:p>
+    <w:p>
+      <w:hyperlink r:id="rId15" w:history="1">
+        <w:proofErr w:type="spellStart"/>
+        <w:r>
+          <w:rPr>
+            <w:rStyle w:val="Lienhypertexte"/>
+          </w:rPr>
+          <w:t>What</w:t>
+        </w:r>
+        <w:proofErr w:type="spellEnd"/>
+        <w:r>
+          <w:rPr>
+            <w:rStyle w:val="Lienhypertexte"/>
+          </w:rPr>
+          <w:t xml:space="preserve"> Materials Are </w:t>
+        </w:r>
+        <w:proofErr w:type="spellStart"/>
+        <w:r>
+          <w:rPr>
+            <w:rStyle w:val="Lienhypertexte"/>
+          </w:rPr>
+          <w:t>Used</w:t>
+        </w:r>
+        <w:proofErr w:type="spellEnd"/>
+        <w:r>
+          <w:rPr>
+            <w:rStyle w:val="Lienhypertexte"/>
+          </w:rPr>
+          <w:t xml:space="preserve"> in Data Centers? | Construction Guide | Mill…</w:t>
+        </w:r>
+      </w:hyperlink>
+    </w:p>
+    <w:p/>
+    <w:p>
+      <w:pPr>
+        <w:pStyle w:val="Paragraphedeliste"/>
+        <w:numPr>
+          <w:ilvl w:val="0"/>
+          <w:numId w:val="3"/>
+        </w:numPr>
+        <w:rPr>
+          <w:b/>
+          <w:bCs/>
+        </w:rPr>
+      </w:pPr>
+      <w:r>
+        <w:rPr>
+          <w:b/>
+          <w:bCs/>
+        </w:rPr>
+        <w:t>Piste solutions socio-économies</w:t>
+      </w:r>
+    </w:p>
+    <w:p>
+      <w:hyperlink r:id="rId16" w:anchor=":~:text=The%20standard%20data%20center%20development%20model%E2%80%94speedy%20dealmaking%20and,access%2C%20and%20permits%20are%20giving%20regions%20new%20leverage." w:history="1">
+        <w:proofErr w:type="spellStart"/>
+        <w:r>
+          <w:rPr>
+            <w:rStyle w:val="Lienhypertexte"/>
+          </w:rPr>
+          <w:t>Turning</w:t>
+        </w:r>
+        <w:proofErr w:type="spellEnd"/>
+        <w:r>
+          <w:rPr>
+            <w:rStyle w:val="Lienhypertexte"/>
+          </w:rPr>
+          <w:t xml:space="preserve"> the data center boom </w:t>
+        </w:r>
+        <w:proofErr w:type="spellStart"/>
+        <w:r>
+          <w:rPr>
+            <w:rStyle w:val="Lienhypertexte"/>
+          </w:rPr>
+          <w:t>into</w:t>
+        </w:r>
+        <w:proofErr w:type="spellEnd"/>
+        <w:r>
+          <w:rPr>
+            <w:rStyle w:val="Lienhypertexte"/>
+          </w:rPr>
+          <w:t xml:space="preserve"> long-</w:t>
+        </w:r>
+        <w:proofErr w:type="spellStart"/>
+        <w:r>
+          <w:rPr>
+            <w:rStyle w:val="Lienhypertexte"/>
+          </w:rPr>
+          <w:t>term</w:t>
+        </w:r>
+        <w:proofErr w:type="spellEnd"/>
+        <w:r>
+          <w:rPr>
+            <w:rStyle w:val="Lienhypertexte"/>
+          </w:rPr>
+          <w:t xml:space="preserve">, local </w:t>
+        </w:r>
+        <w:proofErr w:type="spellStart"/>
+        <w:r>
+          <w:rPr>
+            <w:rStyle w:val="Lienhypertexte"/>
+          </w:rPr>
+          <w:t>prosperity</w:t>
+        </w:r>
+        <w:proofErr w:type="spellEnd"/>
+        <w:r>
+          <w:rPr>
+            <w:rStyle w:val="Lienhypertexte"/>
+          </w:rPr>
+          <w:t xml:space="preserve"> | Brookings</w:t>
+        </w:r>
+      </w:hyperlink>
+    </w:p>
+    <w:p/>
+    <w:p/>
+    <w:p>
+      <w:pPr>
+        <w:pStyle w:val="Paragraphedeliste"/>
+        <w:numPr>
+          <w:ilvl w:val="0"/>
+          <w:numId w:val="3"/>
+        </w:numPr>
+      </w:pPr>
+      <w:r>
+        <w:t>Controverse Générales.</w:t>
+      </w:r>
+    </w:p>
+    <w:p>
+      <w:hyperlink r:id="rId17" w:history="1">
+        <w:r>
+          <w:rPr>
+            <w:rStyle w:val="Lienhypertexte"/>
+          </w:rPr>
+          <w:t xml:space="preserve">Why Data Centers Are </w:t>
+        </w:r>
+        <w:proofErr w:type="spellStart"/>
+        <w:r>
+          <w:rPr>
+            <w:rStyle w:val="Lienhypertexte"/>
+          </w:rPr>
+          <w:t>Booming</w:t>
+        </w:r>
+        <w:proofErr w:type="spellEnd"/>
+        <w:r>
+          <w:rPr>
+            <w:rStyle w:val="Lienhypertexte"/>
+          </w:rPr>
+          <w:t xml:space="preserve">—And </w:t>
+        </w:r>
+        <w:proofErr w:type="spellStart"/>
+        <w:r>
+          <w:rPr>
+            <w:rStyle w:val="Lienhypertexte"/>
+          </w:rPr>
+          <w:t>What</w:t>
+        </w:r>
+        <w:proofErr w:type="spellEnd"/>
+        <w:r>
+          <w:rPr>
+            <w:rStyle w:val="Lienhypertexte"/>
+          </w:rPr>
+          <w:t xml:space="preserve"> </w:t>
+        </w:r>
+        <w:proofErr w:type="spellStart"/>
+        <w:r>
+          <w:rPr>
+            <w:rStyle w:val="Lienhypertexte"/>
+          </w:rPr>
+          <w:t>They're</w:t>
+        </w:r>
+        <w:proofErr w:type="spellEnd"/>
+        <w:r>
+          <w:rPr>
+            <w:rStyle w:val="Lienhypertexte"/>
+          </w:rPr>
+          <w:t xml:space="preserve"> </w:t>
+        </w:r>
+        <w:proofErr w:type="spellStart"/>
+        <w:r>
+          <w:rPr>
+            <w:rStyle w:val="Lienhypertexte"/>
+          </w:rPr>
+          <w:t>Actually</w:t>
+        </w:r>
+        <w:proofErr w:type="spellEnd"/>
+        <w:r>
+          <w:rPr>
+            <w:rStyle w:val="Lienhypertexte"/>
+          </w:rPr>
+          <w:t xml:space="preserve"> For</w:t>
+        </w:r>
+      </w:hyperlink>
+    </w:p>
+    <w:p/>
+    <w:p>
+      <w:pPr>
+        <w:pStyle w:val="Paragraphedeliste"/>
+        <w:numPr>
+          <w:ilvl w:val="0"/>
+          <w:numId w:val="3"/>
+        </w:numPr>
+      </w:pPr>
+      <w:r>
+        <w:t>Stats précises</w:t>
+      </w:r>
+    </w:p>
+    <w:p>
+      <w:pPr>
+        <w:ind w:left="360" w:firstLine="348"/>
+      </w:pPr>
+      <w:hyperlink r:id="rId18" w:anchor="Water_footprint" w:history="1">
+        <w:r>
+          <w:rPr>
+            <w:rStyle w:val="Lienhypertexte"/>
+          </w:rPr>
+          <w:t xml:space="preserve">Data center - </w:t>
+        </w:r>
+        <w:proofErr w:type="spellStart"/>
+        <w:r>
+          <w:rPr>
+            <w:rStyle w:val="Lienhypertexte"/>
+          </w:rPr>
+          <w:t>Wikipedia</w:t>
+        </w:r>
+        <w:proofErr w:type="spellEnd"/>
+      </w:hyperlink>
+    </w:p>
+    <w:p>
+      <w:pPr>
+        <w:pStyle w:val="Paragraphedeliste"/>
+        <w:numPr>
+          <w:ilvl w:val="0"/>
+          <w:numId w:val="3"/>
+        </w:numPr>
+      </w:pPr>
+      <w:proofErr w:type="spellStart"/>
+      <w:r>
+        <w:t>Who</w:t>
+      </w:r>
+      <w:proofErr w:type="spellEnd"/>
+      <w:r>
+        <w:t xml:space="preserve"> </w:t>
+      </w:r>
+      <w:proofErr w:type="spellStart"/>
+      <w:r>
+        <w:t>benefits</w:t>
+      </w:r>
+      <w:proofErr w:type="spellEnd"/>
+      <w:r>
+        <w:t xml:space="preserve"> ?</w:t>
+      </w:r>
+    </w:p>
+    <w:p>
+      <w:pPr>
+        <w:ind w:left="360"/>
+      </w:pPr>
+      <w:hyperlink r:id="rId19" w:anchor=":~:text=The%20researchers%E2%80%99%20clearest%20finding%20is%20that%20metropolitan%20areas,business%20growth%2C%20non-metro%20counties%20saw%20no%20measurable%20gains." w:history="1">
+        <w:r>
+          <w:rPr>
+            <w:rStyle w:val="Lienhypertexte"/>
             <w:lang w:val="en-CA"/>
           </w:rPr>
-          <w:t>What are data centers? Here’s how they work and why they matter - Poynter</w:t>
+          <w:t xml:space="preserve">Data Centers Are Booming. Who Benefits? </w:t>
+        </w:r>
+        <w:r>
+          <w:rPr>
+            <w:rStyle w:val="Lienhypertexte"/>
+          </w:rPr>
+          <w:t xml:space="preserve">| </w:t>
+        </w:r>
+        <w:proofErr w:type="spellStart"/>
+        <w:r>
+          <w:rPr>
+            <w:rStyle w:val="Lienhypertexte"/>
+          </w:rPr>
+          <w:t>Research</w:t>
+        </w:r>
+        <w:proofErr w:type="spellEnd"/>
+        <w:r>
+          <w:rPr>
+            <w:rStyle w:val="Lienhypertexte"/>
+          </w:rPr>
+          <w:t xml:space="preserve"> News Center</w:t>
         </w:r>
       </w:hyperlink>
     </w:p>
     <w:p/>
-    <w:p>
-      <w:pPr>
-        <w:rPr>
-          <w:lang w:val="en-CA"/>
-        </w:rPr>
-      </w:pPr>
-      <w:hyperlink r:id="rId6" w:history="1">
-        <w:r>
-          <w:rPr>
-            <w:rStyle w:val="Hyperlink"/>
-            <w:lang w:val="en-CA"/>
-          </w:rPr>
-          <w:t xml:space="preserve">What Materials Are Used in Data Centers? </w:t>
-        </w:r>
-        <w:r>
-          <w:rPr>
-            <w:rStyle w:val="Hyperlink"/>
-          </w:rPr>
-          <w:t>| Construction Guide | Mill…</w:t>
-        </w:r>
-      </w:hyperlink>
-    </w:p>
     <w:sectPr>
       <w:pgSz w:w="12240" w:h="15840"/>
       <w:pgMar w:top="1440" w:right="1440" w:bottom="1440" w:left="1440" w:header="708" w:footer="708" w:gutter="0"/>
@@ -459,8 +3205,58 @@
 </w:document>
 </file>
 
+<file path=word/endnotes.xml><?xml version="1.0" encoding="utf-8"?>
+<w:endnotes xmlns:wpc="http://schemas.microsoft.com/office/word/2010/wordprocessingCanvas" xmlns:cx="http://schemas.microsoft.com/office/drawing/2014/chartex" xmlns:cx1="http://schemas.microsoft.com/office/drawing/2015/9/8/chartex" xmlns:cx2="http://schemas.microsoft.com/office/drawing/2015/10/21/chartex" xmlns:cx3="http://schemas.microsoft.com/office/drawing/2016/5/9/chartex" xmlns:cx4="http://schemas.microsoft.com/office/drawing/2016/5/10/chartex" xmlns:cx5="http://schemas.microsoft.com/office/drawing/2016/5/11/chartex" xmlns:cx6="http://schemas.microsoft.com/office/drawing/2016/5/12/chartex" xmlns:cx7="http://schemas.microsoft.com/office/drawing/2016/5/13/chartex" xmlns:cx8="http://schemas.microsoft.com/office/drawing/2016/5/14/chartex" xmlns:mc="http://schemas.openxmlformats.org/markup-compatibility/2006" xmlns:aink="http://schemas.microsoft.com/office/drawing/2016/ink" xmlns:am3d="http://schemas.microsoft.com/office/drawing/2017/model3d" xmlns:o="urn:schemas-microsoft-com:office:office" xmlns:oel="http://schemas.microsoft.com/office/2019/extlst" xmlns:r="http://schemas.openxmlformats.org/officeDocument/2006/relationships" xmlns:m="http://schemas.openxmlformats.org/officeDocument/2006/math" xmlns:v="urn:schemas-microsoft-com:vml" xmlns:wp14="http://schemas.microsoft.com/office/word/2010/wordprocessingDrawing" xmlns:wp="http://schemas.openxmlformats.org/drawingml/2006/wordprocessingDrawing" xmlns:w10="urn:schemas-microsoft-com:office:word" xmlns:w="http://schemas.openxmlformats.org/wordprocessingml/2006/main" xmlns:w14="http://schemas.microsoft.com/office/word/2010/wordml" xmlns:w15="http://schemas.microsoft.com/office/word/2012/wordml" xmlns:w16cei="http://schemas.microsoft.com/office/word/2026/wordml/cei" xmlns:w16cex="http://schemas.microsoft.com/office/word/2018/wordml/cex" xmlns:w16cid="http://schemas.microsoft.com/office/word/2016/wordml/cid" xmlns:w16="http://schemas.microsoft.com/office/word/2018/wordml" xmlns:w16du="http://schemas.microsoft.com/office/word/2023/wordml/word16du" xmlns:w16sdtdh="http://schemas.microsoft.com/office/word/2020/wordml/sdtdatahash" xmlns:w16sdtfl="http://schemas.microsoft.com/office/word/2024/wordml/sdtformatlock" xmlns:w16se="http://schemas.microsoft.com/office/word/2015/wordml/symex" xmlns:wpg="http://schemas.microsoft.com/office/word/2010/wordprocessingGroup" xmlns:wpi="http://schemas.microsoft.com/office/word/2010/wordprocessingInk" xmlns:wne="http://schemas.microsoft.com/office/word/2006/wordml" xmlns:wps="http://schemas.microsoft.com/office/word/2010/wordprocessingShape" mc:Ignorable="w14 w15 w16se w16cid w16 w16cex w16sdtdh w16sdtfl w16du wp14">
+  <w:endnote w:type="separator" w:id="-1">
+    <w:p>
+      <w:pPr>
+        <w:spacing w:after="0" w:line="240" w:lineRule="auto"/>
+      </w:pPr>
+      <w:r>
+        <w:separator/>
+      </w:r>
+    </w:p>
+  </w:endnote>
+  <w:endnote w:type="continuationSeparator" w:id="0">
+    <w:p>
+      <w:pPr>
+        <w:spacing w:after="0" w:line="240" w:lineRule="auto"/>
+      </w:pPr>
+      <w:r>
+        <w:continuationSeparator/>
+      </w:r>
+    </w:p>
+  </w:endnote>
+</w:endnotes>
+</file>
+
+<file path=word/footnotes.xml><?xml version="1.0" encoding="utf-8"?>
+<w:footnotes xmlns:wpc="http://schemas.microsoft.com/office/word/2010/wordprocessingCanvas" xmlns:cx="http://schemas.microsoft.com/office/drawing/2014/chartex" xmlns:cx1="http://schemas.microsoft.com/office/drawing/2015/9/8/chartex" xmlns:cx2="http://schemas.microsoft.com/office/drawing/2015/10/21/chartex" xmlns:cx3="http://schemas.microsoft.com/office/drawing/2016/5/9/chartex" xmlns:cx4="http://schemas.microsoft.com/office/drawing/2016/5/10/chartex" xmlns:cx5="http://schemas.microsoft.com/office/drawing/2016/5/11/chartex" xmlns:cx6="http://schemas.microsoft.com/office/drawing/2016/5/12/chartex" xmlns:cx7="http://schemas.microsoft.com/office/drawing/2016/5/13/chartex" xmlns:cx8="http://schemas.microsoft.com/office/drawing/2016/5/14/chartex" xmlns:mc="http://schemas.openxmlformats.org/markup-compatibility/2006" xmlns:aink="http://schemas.microsoft.com/office/drawing/2016/ink" xmlns:am3d="http://schemas.microsoft.com/office/drawing/2017/model3d" xmlns:o="urn:schemas-microsoft-com:office:office" xmlns:oel="http://schemas.microsoft.com/office/2019/extlst" xmlns:r="http://schemas.openxmlformats.org/officeDocument/2006/relationships" xmlns:m="http://schemas.openxmlformats.org/officeDocument/2006/math" xmlns:v="urn:schemas-microsoft-com:vml" xmlns:wp14="http://schemas.microsoft.com/office/word/2010/wordprocessingDrawing" xmlns:wp="http://schemas.openxmlformats.org/drawingml/2006/wordprocessingDrawing" xmlns:w10="urn:schemas-microsoft-com:office:word" xmlns:w="http://schemas.openxmlformats.org/wordprocessingml/2006/main" xmlns:w14="http://schemas.microsoft.com/office/word/2010/wordml" xmlns:w15="http://schemas.microsoft.com/office/word/2012/wordml" xmlns:w16cei="http://schemas.microsoft.com/office/word/2026/wordml/cei" xmlns:w16cex="http://schemas.microsoft.com/office/word/2018/wordml/cex" xmlns:w16cid="http://schemas.microsoft.com/office/word/2016/wordml/cid" xmlns:w16="http://schemas.microsoft.com/office/word/2018/wordml" xmlns:w16du="http://schemas.microsoft.com/office/word/2023/wordml/word16du" xmlns:w16sdtdh="http://schemas.microsoft.com/office/word/2020/wordml/sdtdatahash" xmlns:w16sdtfl="http://schemas.microsoft.com/office/word/2024/wordml/sdtformatlock" xmlns:w16se="http://schemas.microsoft.com/office/word/2015/wordml/symex" xmlns:wpg="http://schemas.microsoft.com/office/word/2010/wordprocessingGroup" xmlns:wpi="http://schemas.microsoft.com/office/word/2010/wordprocessingInk" xmlns:wne="http://schemas.microsoft.com/office/word/2006/wordml" xmlns:wps="http://schemas.microsoft.com/office/word/2010/wordprocessingShape" mc:Ignorable="w14 w15 w16se w16cid w16 w16cex w16sdtdh w16sdtfl w16du wp14">
+  <w:footnote w:type="separator" w:id="-1">
+    <w:p>
+      <w:pPr>
+        <w:spacing w:after="0" w:line="240" w:lineRule="auto"/>
+      </w:pPr>
+      <w:r>
+        <w:separator/>
+      </w:r>
+    </w:p>
+  </w:footnote>
+  <w:footnote w:type="continuationSeparator" w:id="0">
+    <w:p>
+      <w:pPr>
+        <w:spacing w:after="0" w:line="240" w:lineRule="auto"/>
+      </w:pPr>
+      <w:r>
+        <w:continuationSeparator/>
+      </w:r>
+    </w:p>
+  </w:footnote>
+</w:footnotes>
+</file>
+
 <file path=word/numbering.xml><?xml version="1.0" encoding="utf-8"?>
-<w:numbering xmlns:wpc="http://schemas.microsoft.com/office/word/2010/wordprocessingCanvas" xmlns:cx="http://schemas.microsoft.com/office/drawing/2014/chartex" xmlns:cx1="http://schemas.microsoft.com/office/drawing/2015/9/8/chartex" xmlns:cx2="http://schemas.microsoft.com/office/drawing/2015/10/21/chartex" xmlns:cx3="http://schemas.microsoft.com/office/drawing/2016/5/9/chartex" xmlns:cx4="http://schemas.microsoft.com/office/drawing/2016/5/10/chartex" xmlns:cx5="http://schemas.microsoft.com/office/drawing/2016/5/11/chartex" xmlns:cx6="http://schemas.microsoft.com/office/drawing/2016/5/12/chartex" xmlns:cx7="http://schemas.microsoft.com/office/drawing/2016/5/13/chartex" xmlns:cx8="http://schemas.microsoft.com/office/drawing/2016/5/14/chartex" xmlns:mc="http://schemas.openxmlformats.org/markup-compatibility/2006" xmlns:aink="http://schemas.microsoft.com/office/drawing/2016/ink" xmlns:am3d="http://schemas.microsoft.com/office/drawing/2017/model3d" xmlns:o="urn:schemas-microsoft-com:office:office" xmlns:oel="http://schemas.microsoft.com/office/2019/extlst" xmlns:r="http://schemas.openxmlformats.org/officeDocument/2006/relationships" xmlns:m="http://schemas.openxmlformats.org/officeDocument/2006/math" xmlns:v="urn:schemas-microsoft-com:vml" xmlns:wp14="http://schemas.microsoft.com/office/word/2010/wordprocessingDrawing" xmlns:wp="http://schemas.openxmlformats.org/drawingml/2006/wordprocessingDrawing" xmlns:w10="urn:schemas-microsoft-com:office:word" xmlns:w="http://schemas.openxmlformats.org/wordprocessingml/2006/main" xmlns:w14="http://schemas.microsoft.com/office/word/2010/wordml" xmlns:w15="http://schemas.microsoft.com/office/word/2012/wordml" xmlns:w16cex="http://schemas.microsoft.com/office/word/2018/wordml/cex" xmlns:w16cid="http://schemas.microsoft.com/office/word/2016/wordml/cid" xmlns:w16="http://schemas.microsoft.com/office/word/2018/wordml" xmlns:w16du="http://schemas.microsoft.com/office/word/2023/wordml/word16du" xmlns:w16sdtdh="http://schemas.microsoft.com/office/word/2020/wordml/sdtdatahash" xmlns:w16sdtfl="http://schemas.microsoft.com/office/word/2024/wordml/sdtformatlock" xmlns:w16se="http://schemas.microsoft.com/office/word/2015/wordml/symex" xmlns:wpg="http://schemas.microsoft.com/office/word/2010/wordprocessingGroup" xmlns:wpi="http://schemas.microsoft.com/office/word/2010/wordprocessingInk" xmlns:wne="http://schemas.microsoft.com/office/word/2006/wordml" xmlns:wps="http://schemas.microsoft.com/office/word/2010/wordprocessingShape" mc:Ignorable="w14 w15 w16se w16cid w16 w16cex w16sdtdh w16sdtfl w16du wp14">
+<w:numbering xmlns:wpc="http://schemas.microsoft.com/office/word/2010/wordprocessingCanvas" xmlns:cx="http://schemas.microsoft.com/office/drawing/2014/chartex" xmlns:cx1="http://schemas.microsoft.com/office/drawing/2015/9/8/chartex" xmlns:cx2="http://schemas.microsoft.com/office/drawing/2015/10/21/chartex" xmlns:cx3="http://schemas.microsoft.com/office/drawing/2016/5/9/chartex" xmlns:cx4="http://schemas.microsoft.com/office/drawing/2016/5/10/chartex" xmlns:cx5="http://schemas.microsoft.com/office/drawing/2016/5/11/chartex" xmlns:cx6="http://schemas.microsoft.com/office/drawing/2016/5/12/chartex" xmlns:cx7="http://schemas.microsoft.com/office/drawing/2016/5/13/chartex" xmlns:cx8="http://schemas.microsoft.com/office/drawing/2016/5/14/chartex" xmlns:mc="http://schemas.openxmlformats.org/markup-compatibility/2006" xmlns:aink="http://schemas.microsoft.com/office/drawing/2016/ink" xmlns:am3d="http://schemas.microsoft.com/office/drawing/2017/model3d" xmlns:o="urn:schemas-microsoft-com:office:office" xmlns:oel="http://schemas.microsoft.com/office/2019/extlst" xmlns:r="http://schemas.openxmlformats.org/officeDocument/2006/relationships" xmlns:m="http://schemas.openxmlformats.org/officeDocument/2006/math" xmlns:v="urn:schemas-microsoft-com:vml" xmlns:wp14="http://schemas.microsoft.com/office/word/2010/wordprocessingDrawing" xmlns:wp="http://schemas.openxmlformats.org/drawingml/2006/wordprocessingDrawing" xmlns:w10="urn:schemas-microsoft-com:office:word" xmlns:w="http://schemas.openxmlformats.org/wordprocessingml/2006/main" xmlns:w14="http://schemas.microsoft.com/office/word/2010/wordml" xmlns:w15="http://schemas.microsoft.com/office/word/2012/wordml" xmlns:w16cei="http://schemas.microsoft.com/office/word/2026/wordml/cei" xmlns:w16cex="http://schemas.microsoft.com/office/word/2018/wordml/cex" xmlns:w16cid="http://schemas.microsoft.com/office/word/2016/wordml/cid" xmlns:w16="http://schemas.microsoft.com/office/word/2018/wordml" xmlns:w16du="http://schemas.microsoft.com/office/word/2023/wordml/word16du" xmlns:w16sdtdh="http://schemas.microsoft.com/office/word/2020/wordml/sdtdatahash" xmlns:w16sdtfl="http://schemas.microsoft.com/office/word/2024/wordml/sdtformatlock" xmlns:w16se="http://schemas.microsoft.com/office/word/2015/wordml/symex" xmlns:wpg="http://schemas.microsoft.com/office/word/2010/wordprocessingGroup" xmlns:wpi="http://schemas.microsoft.com/office/word/2010/wordprocessingInk" xmlns:wne="http://schemas.microsoft.com/office/word/2006/wordml" xmlns:wps="http://schemas.microsoft.com/office/word/2010/wordprocessingShape" mc:Ignorable="w14 w15 w16se w16cid w16 w16cex w16sdtdh w16sdtfl w16du wp14">
   <w:abstractNum w:abstractNumId="0" w15:restartNumberingAfterBreak="0">
     <w:nsid w:val="4CEA6604"/>
     <w:multiLevelType w:val="hybridMultilevel"/>
@@ -551,6 +3347,95 @@
     </w:lvl>
   </w:abstractNum>
   <w:abstractNum w:abstractNumId="1" w15:restartNumberingAfterBreak="0">
+    <w:nsid w:val="500B7692"/>
+    <w:multiLevelType w:val="hybridMultilevel"/>
+    <w:tmpl w:val="BFE8A064"/>
+    <w:lvl w:ilvl="0" w:tplc="0C0C000F">
+      <w:start w:val="1"/>
+      <w:numFmt w:val="decimal"/>
+      <w:lvlText w:val="%1."/>
+      <w:lvlJc w:val="left"/>
+      <w:pPr>
+        <w:ind w:left="720" w:hanging="360"/>
+      </w:pPr>
+      <w:rPr>
+        <w:rFonts w:hint="default"/>
+      </w:rPr>
+    </w:lvl>
+    <w:lvl w:ilvl="1" w:tplc="0C0C0019" w:tentative="1">
+      <w:start w:val="1"/>
+      <w:numFmt w:val="lowerLetter"/>
+      <w:lvlText w:val="%2."/>
+      <w:lvlJc w:val="left"/>
+      <w:pPr>
+        <w:ind w:left="1440" w:hanging="360"/>
+      </w:pPr>
+    </w:lvl>
+    <w:lvl w:ilvl="2" w:tplc="0C0C001B" w:tentative="1">
+      <w:start w:val="1"/>
+      <w:numFmt w:val="lowerRoman"/>
+      <w:lvlText w:val="%3."/>
+      <w:lvlJc w:val="right"/>
+      <w:pPr>
+        <w:ind w:left="2160" w:hanging="180"/>
+      </w:pPr>
+    </w:lvl>
+    <w:lvl w:ilvl="3" w:tplc="0C0C000F" w:tentative="1">
+      <w:start w:val="1"/>
+      <w:numFmt w:val="decimal"/>
+      <w:lvlText w:val="%4."/>
+      <w:lvlJc w:val="left"/>
+      <w:pPr>
+        <w:ind w:left="2880" w:hanging="360"/>
+      </w:pPr>
+    </w:lvl>
+    <w:lvl w:ilvl="4" w:tplc="0C0C0019" w:tentative="1">
+      <w:start w:val="1"/>
+      <w:numFmt w:val="lowerLetter"/>
+      <w:lvlText w:val="%5."/>
+      <w:lvlJc w:val="left"/>
+      <w:pPr>
+        <w:ind w:left="3600" w:hanging="360"/>
+      </w:pPr>
+    </w:lvl>
+    <w:lvl w:ilvl="5" w:tplc="0C0C001B" w:tentative="1">
+      <w:start w:val="1"/>
+      <w:numFmt w:val="lowerRoman"/>
+      <w:lvlText w:val="%6."/>
+      <w:lvlJc w:val="right"/>
+      <w:pPr>
+        <w:ind w:left="4320" w:hanging="180"/>
+      </w:pPr>
+    </w:lvl>
+    <w:lvl w:ilvl="6" w:tplc="0C0C000F" w:tentative="1">
+      <w:start w:val="1"/>
+      <w:numFmt w:val="decimal"/>
+      <w:lvlText w:val="%7."/>
+      <w:lvlJc w:val="left"/>
+      <w:pPr>
+        <w:ind w:left="5040" w:hanging="360"/>
+      </w:pPr>
+    </w:lvl>
+    <w:lvl w:ilvl="7" w:tplc="0C0C0019" w:tentative="1">
+      <w:start w:val="1"/>
+      <w:numFmt w:val="lowerLetter"/>
+      <w:lvlText w:val="%8."/>
+      <w:lvlJc w:val="left"/>
+      <w:pPr>
+        <w:ind w:left="5760" w:hanging="360"/>
+      </w:pPr>
+    </w:lvl>
+    <w:lvl w:ilvl="8" w:tplc="0C0C001B" w:tentative="1">
+      <w:start w:val="1"/>
+      <w:numFmt w:val="lowerRoman"/>
+      <w:lvlText w:val="%9."/>
+      <w:lvlJc w:val="right"/>
+      <w:pPr>
+        <w:ind w:left="6480" w:hanging="180"/>
+      </w:pPr>
+    </w:lvl>
+  </w:abstractNum>
+  <w:abstractNum w:abstractNumId="2" w15:restartNumberingAfterBreak="0">
     <w:nsid w:val="67A27A66"/>
     <w:multiLevelType w:val="hybridMultilevel"/>
     <w:tmpl w:val="FDDA561C"/>
@@ -667,6 +3552,9 @@
     <w:abstractNumId w:val="0"/>
   </w:num>
   <w:num w:numId="2" w16cid:durableId="508568303">
+    <w:abstractNumId w:val="2"/>
+  </w:num>
+  <w:num w:numId="3" w16cid:durableId="246696156">
     <w:abstractNumId w:val="1"/>
   </w:num>
 </w:numbering>
@@ -1073,11 +3961,11 @@
     <w:name w:val="Normal"/>
     <w:qFormat/>
   </w:style>
-  <w:style w:type="paragraph" w:styleId="Heading1">
+  <w:style w:type="paragraph" w:styleId="Titre1">
     <w:name w:val="heading 1"/>
     <w:basedOn w:val="Normal"/>
     <w:next w:val="Normal"/>
-    <w:link w:val="Heading1Char"/>
+    <w:link w:val="Titre1Car"/>
     <w:uiPriority w:val="9"/>
     <w:qFormat/>
     <w:rsid w:val="00890116"/>
@@ -1094,11 +3982,11 @@
       <w:szCs w:val="40"/>
     </w:rPr>
   </w:style>
-  <w:style w:type="paragraph" w:styleId="Heading2">
+  <w:style w:type="paragraph" w:styleId="Titre2">
     <w:name w:val="heading 2"/>
     <w:basedOn w:val="Normal"/>
     <w:next w:val="Normal"/>
-    <w:link w:val="Heading2Char"/>
+    <w:link w:val="Titre2Car"/>
     <w:uiPriority w:val="9"/>
     <w:semiHidden/>
     <w:unhideWhenUsed/>
@@ -1117,11 +4005,11 @@
       <w:szCs w:val="32"/>
     </w:rPr>
   </w:style>
-  <w:style w:type="paragraph" w:styleId="Heading3">
+  <w:style w:type="paragraph" w:styleId="Titre3">
     <w:name w:val="heading 3"/>
     <w:basedOn w:val="Normal"/>
     <w:next w:val="Normal"/>
-    <w:link w:val="Heading3Char"/>
+    <w:link w:val="Titre3Car"/>
     <w:uiPriority w:val="9"/>
     <w:semiHidden/>
     <w:unhideWhenUsed/>
@@ -1140,11 +4028,11 @@
       <w:szCs w:val="28"/>
     </w:rPr>
   </w:style>
-  <w:style w:type="paragraph" w:styleId="Heading4">
+  <w:style w:type="paragraph" w:styleId="Titre4">
     <w:name w:val="heading 4"/>
     <w:basedOn w:val="Normal"/>
     <w:next w:val="Normal"/>
-    <w:link w:val="Heading4Char"/>
+    <w:link w:val="Titre4Car"/>
     <w:uiPriority w:val="9"/>
     <w:semiHidden/>
     <w:unhideWhenUsed/>
@@ -1163,11 +4051,11 @@
       <w:color w:val="0F4761" w:themeColor="accent1" w:themeShade="BF"/>
     </w:rPr>
   </w:style>
-  <w:style w:type="paragraph" w:styleId="Heading5">
+  <w:style w:type="paragraph" w:styleId="Titre5">
     <w:name w:val="heading 5"/>
     <w:basedOn w:val="Normal"/>
     <w:next w:val="Normal"/>
-    <w:link w:val="Heading5Char"/>
+    <w:link w:val="Titre5Car"/>
     <w:uiPriority w:val="9"/>
     <w:semiHidden/>
     <w:unhideWhenUsed/>
@@ -1184,11 +4072,11 @@
       <w:color w:val="0F4761" w:themeColor="accent1" w:themeShade="BF"/>
     </w:rPr>
   </w:style>
-  <w:style w:type="paragraph" w:styleId="Heading6">
+  <w:style w:type="paragraph" w:styleId="Titre6">
     <w:name w:val="heading 6"/>
     <w:basedOn w:val="Normal"/>
     <w:next w:val="Normal"/>
-    <w:link w:val="Heading6Char"/>
+    <w:link w:val="Titre6Car"/>
     <w:uiPriority w:val="9"/>
     <w:semiHidden/>
     <w:unhideWhenUsed/>
@@ -1207,11 +4095,11 @@
       <w:color w:val="595959" w:themeColor="text1" w:themeTint="A6"/>
     </w:rPr>
   </w:style>
-  <w:style w:type="paragraph" w:styleId="Heading7">
+  <w:style w:type="paragraph" w:styleId="Titre7">
     <w:name w:val="heading 7"/>
     <w:basedOn w:val="Normal"/>
     <w:next w:val="Normal"/>
-    <w:link w:val="Heading7Char"/>
+    <w:link w:val="Titre7Car"/>
     <w:uiPriority w:val="9"/>
     <w:semiHidden/>
     <w:unhideWhenUsed/>
@@ -1228,11 +4116,11 @@
       <w:color w:val="595959" w:themeColor="text1" w:themeTint="A6"/>
     </w:rPr>
   </w:style>
-  <w:style w:type="paragraph" w:styleId="Heading8">
+  <w:style w:type="paragraph" w:styleId="Titre8">
     <w:name w:val="heading 8"/>
     <w:basedOn w:val="Normal"/>
     <w:next w:val="Normal"/>
-    <w:link w:val="Heading8Char"/>
+    <w:link w:val="Titre8Car"/>
     <w:uiPriority w:val="9"/>
     <w:semiHidden/>
     <w:unhideWhenUsed/>
@@ -1251,11 +4139,11 @@
       <w:color w:val="272727" w:themeColor="text1" w:themeTint="D8"/>
     </w:rPr>
   </w:style>
-  <w:style w:type="paragraph" w:styleId="Heading9">
+  <w:style w:type="paragraph" w:styleId="Titre9">
     <w:name w:val="heading 9"/>
     <w:basedOn w:val="Normal"/>
     <w:next w:val="Normal"/>
-    <w:link w:val="Heading9Char"/>
+    <w:link w:val="Titre9Car"/>
     <w:uiPriority w:val="9"/>
     <w:semiHidden/>
     <w:unhideWhenUsed/>
@@ -1272,12 +4160,12 @@
       <w:color w:val="272727" w:themeColor="text1" w:themeTint="D8"/>
     </w:rPr>
   </w:style>
-  <w:style w:type="character" w:default="1" w:styleId="DefaultParagraphFont">
+  <w:style w:type="character" w:default="1" w:styleId="Policepardfaut">
     <w:name w:val="Default Paragraph Font"/>
     <w:uiPriority w:val="1"/>
     <w:unhideWhenUsed/>
   </w:style>
-  <w:style w:type="table" w:default="1" w:styleId="TableNormal">
+  <w:style w:type="table" w:default="1" w:styleId="TableauNormal">
     <w:name w:val="Normal Table"/>
     <w:uiPriority w:val="99"/>
     <w:semiHidden/>
@@ -1292,16 +4180,16 @@
       </w:tblCellMar>
     </w:tblPr>
   </w:style>
-  <w:style w:type="numbering" w:default="1" w:styleId="NoList">
+  <w:style w:type="numbering" w:default="1" w:styleId="Aucuneliste">
     <w:name w:val="No List"/>
     <w:uiPriority w:val="99"/>
     <w:semiHidden/>
     <w:unhideWhenUsed/>
   </w:style>
-  <w:style w:type="character" w:customStyle="1" w:styleId="Heading1Char">
-    <w:name w:val="Heading 1 Char"/>
-    <w:basedOn w:val="DefaultParagraphFont"/>
-    <w:link w:val="Heading1"/>
+  <w:style w:type="character" w:customStyle="1" w:styleId="Titre1Car">
+    <w:name w:val="Titre 1 Car"/>
+    <w:basedOn w:val="Policepardfaut"/>
+    <w:link w:val="Titre1"/>
     <w:uiPriority w:val="9"/>
     <w:rsid w:val="00890116"/>
     <w:rPr>
@@ -1311,10 +4199,10 @@
       <w:szCs w:val="40"/>
     </w:rPr>
   </w:style>
-  <w:style w:type="character" w:customStyle="1" w:styleId="Heading2Char">
-    <w:name w:val="Heading 2 Char"/>
-    <w:basedOn w:val="DefaultParagraphFont"/>
-    <w:link w:val="Heading2"/>
+  <w:style w:type="character" w:customStyle="1" w:styleId="Titre2Car">
+    <w:name w:val="Titre 2 Car"/>
+    <w:basedOn w:val="Policepardfaut"/>
+    <w:link w:val="Titre2"/>
     <w:uiPriority w:val="9"/>
     <w:semiHidden/>
     <w:rsid w:val="00890116"/>
@@ -1325,10 +4213,10 @@
       <w:szCs w:val="32"/>
     </w:rPr>
   </w:style>
-  <w:style w:type="character" w:customStyle="1" w:styleId="Heading3Char">
-    <w:name w:val="Heading 3 Char"/>
-    <w:basedOn w:val="DefaultParagraphFont"/>
-    <w:link w:val="Heading3"/>
+  <w:style w:type="character" w:customStyle="1" w:styleId="Titre3Car">
+    <w:name w:val="Titre 3 Car"/>
+    <w:basedOn w:val="Policepardfaut"/>
+    <w:link w:val="Titre3"/>
     <w:uiPriority w:val="9"/>
     <w:semiHidden/>
     <w:rsid w:val="00890116"/>
@@ -1339,10 +4227,10 @@
       <w:szCs w:val="28"/>
     </w:rPr>
   </w:style>
-  <w:style w:type="character" w:customStyle="1" w:styleId="Heading4Char">
-    <w:name w:val="Heading 4 Char"/>
-    <w:basedOn w:val="DefaultParagraphFont"/>
-    <w:link w:val="Heading4"/>
+  <w:style w:type="character" w:customStyle="1" w:styleId="Titre4Car">
+    <w:name w:val="Titre 4 Car"/>
+    <w:basedOn w:val="Policepardfaut"/>
+    <w:link w:val="Titre4"/>
     <w:uiPriority w:val="9"/>
     <w:semiHidden/>
     <w:rsid w:val="00890116"/>
@@ -1353,10 +4241,10 @@
       <w:color w:val="0F4761" w:themeColor="accent1" w:themeShade="BF"/>
     </w:rPr>
   </w:style>
-  <w:style w:type="character" w:customStyle="1" w:styleId="Heading5Char">
-    <w:name w:val="Heading 5 Char"/>
-    <w:basedOn w:val="DefaultParagraphFont"/>
-    <w:link w:val="Heading5"/>
+  <w:style w:type="character" w:customStyle="1" w:styleId="Titre5Car">
+    <w:name w:val="Titre 5 Car"/>
+    <w:basedOn w:val="Policepardfaut"/>
+    <w:link w:val="Titre5"/>
     <w:uiPriority w:val="9"/>
     <w:semiHidden/>
     <w:rsid w:val="00890116"/>
@@ -1365,10 +4253,10 @@
       <w:color w:val="0F4761" w:themeColor="accent1" w:themeShade="BF"/>
     </w:rPr>
   </w:style>
-  <w:style w:type="character" w:customStyle="1" w:styleId="Heading6Char">
-    <w:name w:val="Heading 6 Char"/>
-    <w:basedOn w:val="DefaultParagraphFont"/>
-    <w:link w:val="Heading6"/>
+  <w:style w:type="character" w:customStyle="1" w:styleId="Titre6Car">
+    <w:name w:val="Titre 6 Car"/>
+    <w:basedOn w:val="Policepardfaut"/>
+    <w:link w:val="Titre6"/>
     <w:uiPriority w:val="9"/>
     <w:semiHidden/>
     <w:rsid w:val="00890116"/>
@@ -1379,10 +4267,10 @@
       <w:color w:val="595959" w:themeColor="text1" w:themeTint="A6"/>
     </w:rPr>
   </w:style>
-  <w:style w:type="character" w:customStyle="1" w:styleId="Heading7Char">
-    <w:name w:val="Heading 7 Char"/>
-    <w:basedOn w:val="DefaultParagraphFont"/>
-    <w:link w:val="Heading7"/>
+  <w:style w:type="character" w:customStyle="1" w:styleId="Titre7Car">
+    <w:name w:val="Titre 7 Car"/>
+    <w:basedOn w:val="Policepardfaut"/>
+    <w:link w:val="Titre7"/>
     <w:uiPriority w:val="9"/>
     <w:semiHidden/>
     <w:rsid w:val="00890116"/>
@@ -1391,10 +4279,10 @@
       <w:color w:val="595959" w:themeColor="text1" w:themeTint="A6"/>
     </w:rPr>
   </w:style>
-  <w:style w:type="character" w:customStyle="1" w:styleId="Heading8Char">
-    <w:name w:val="Heading 8 Char"/>
-    <w:basedOn w:val="DefaultParagraphFont"/>
-    <w:link w:val="Heading8"/>
+  <w:style w:type="character" w:customStyle="1" w:styleId="Titre8Car">
+    <w:name w:val="Titre 8 Car"/>
+    <w:basedOn w:val="Policepardfaut"/>
+    <w:link w:val="Titre8"/>
     <w:uiPriority w:val="9"/>
     <w:semiHidden/>
     <w:rsid w:val="00890116"/>
@@ -1405,10 +4293,10 @@
       <w:color w:val="272727" w:themeColor="text1" w:themeTint="D8"/>
     </w:rPr>
   </w:style>
-  <w:style w:type="character" w:customStyle="1" w:styleId="Heading9Char">
-    <w:name w:val="Heading 9 Char"/>
-    <w:basedOn w:val="DefaultParagraphFont"/>
-    <w:link w:val="Heading9"/>
+  <w:style w:type="character" w:customStyle="1" w:styleId="Titre9Car">
+    <w:name w:val="Titre 9 Car"/>
+    <w:basedOn w:val="Policepardfaut"/>
+    <w:link w:val="Titre9"/>
     <w:uiPriority w:val="9"/>
     <w:semiHidden/>
     <w:rsid w:val="00890116"/>
@@ -1417,11 +4305,11 @@
       <w:color w:val="272727" w:themeColor="text1" w:themeTint="D8"/>
     </w:rPr>
   </w:style>
-  <w:style w:type="paragraph" w:styleId="Title">
+  <w:style w:type="paragraph" w:styleId="Titre">
     <w:name w:val="Title"/>
     <w:basedOn w:val="Normal"/>
     <w:next w:val="Normal"/>
-    <w:link w:val="TitleChar"/>
+    <w:link w:val="TitreCar"/>
     <w:uiPriority w:val="10"/>
     <w:qFormat/>
     <w:rsid w:val="00890116"/>
@@ -1437,10 +4325,10 @@
       <w:szCs w:val="56"/>
     </w:rPr>
   </w:style>
-  <w:style w:type="character" w:customStyle="1" w:styleId="TitleChar">
-    <w:name w:val="Title Char"/>
-    <w:basedOn w:val="DefaultParagraphFont"/>
-    <w:link w:val="Title"/>
+  <w:style w:type="character" w:customStyle="1" w:styleId="TitreCar">
+    <w:name w:val="Titre Car"/>
+    <w:basedOn w:val="Policepardfaut"/>
+    <w:link w:val="Titre"/>
     <w:uiPriority w:val="10"/>
     <w:rsid w:val="00890116"/>
     <w:rPr>
@@ -1451,11 +4339,11 @@
       <w:szCs w:val="56"/>
     </w:rPr>
   </w:style>
-  <w:style w:type="paragraph" w:styleId="Subtitle">
+  <w:style w:type="paragraph" w:styleId="Sous-titre">
     <w:name w:val="Subtitle"/>
     <w:basedOn w:val="Normal"/>
     <w:next w:val="Normal"/>
-    <w:link w:val="SubtitleChar"/>
+    <w:link w:val="Sous-titreCar"/>
     <w:uiPriority w:val="11"/>
     <w:qFormat/>
     <w:rsid w:val="00890116"/>
@@ -1472,10 +4360,10 @@
       <w:szCs w:val="28"/>
     </w:rPr>
   </w:style>
-  <w:style w:type="character" w:customStyle="1" w:styleId="SubtitleChar">
-    <w:name w:val="Subtitle Char"/>
-    <w:basedOn w:val="DefaultParagraphFont"/>
-    <w:link w:val="Subtitle"/>
+  <w:style w:type="character" w:customStyle="1" w:styleId="Sous-titreCar">
+    <w:name w:val="Sous-titre Car"/>
+    <w:basedOn w:val="Policepardfaut"/>
+    <w:link w:val="Sous-titre"/>
     <w:uiPriority w:val="11"/>
     <w:rsid w:val="00890116"/>
     <w:rPr>
@@ -1486,11 +4374,11 @@
       <w:szCs w:val="28"/>
     </w:rPr>
   </w:style>
-  <w:style w:type="paragraph" w:styleId="Quote">
+  <w:style w:type="paragraph" w:styleId="Citation">
     <w:name w:val="Quote"/>
     <w:basedOn w:val="Normal"/>
     <w:next w:val="Normal"/>
-    <w:link w:val="QuoteChar"/>
+    <w:link w:val="CitationCar"/>
     <w:uiPriority w:val="29"/>
     <w:qFormat/>
     <w:rsid w:val="00890116"/>
@@ -1504,10 +4392,10 @@
       <w:color w:val="404040" w:themeColor="text1" w:themeTint="BF"/>
     </w:rPr>
   </w:style>
-  <w:style w:type="character" w:customStyle="1" w:styleId="QuoteChar">
-    <w:name w:val="Quote Char"/>
-    <w:basedOn w:val="DefaultParagraphFont"/>
-    <w:link w:val="Quote"/>
+  <w:style w:type="character" w:customStyle="1" w:styleId="CitationCar">
+    <w:name w:val="Citation Car"/>
+    <w:basedOn w:val="Policepardfaut"/>
+    <w:link w:val="Citation"/>
     <w:uiPriority w:val="29"/>
     <w:rsid w:val="00890116"/>
     <w:rPr>
@@ -1516,7 +4404,7 @@
       <w:color w:val="404040" w:themeColor="text1" w:themeTint="BF"/>
     </w:rPr>
   </w:style>
-  <w:style w:type="paragraph" w:styleId="ListParagraph">
+  <w:style w:type="paragraph" w:styleId="Paragraphedeliste">
     <w:name w:val="List Paragraph"/>
     <w:basedOn w:val="Normal"/>
     <w:uiPriority w:val="34"/>
@@ -1527,9 +4415,9 @@
       <w:contextualSpacing/>
     </w:pPr>
   </w:style>
-  <w:style w:type="character" w:styleId="IntenseEmphasis">
+  <w:style w:type="character" w:styleId="Accentuationintense">
     <w:name w:val="Intense Emphasis"/>
-    <w:basedOn w:val="DefaultParagraphFont"/>
+    <w:basedOn w:val="Policepardfaut"/>
     <w:uiPriority w:val="21"/>
     <w:qFormat/>
     <w:rsid w:val="00890116"/>
@@ -1539,11 +4427,11 @@
       <w:color w:val="0F4761" w:themeColor="accent1" w:themeShade="BF"/>
     </w:rPr>
   </w:style>
-  <w:style w:type="paragraph" w:styleId="IntenseQuote">
+  <w:style w:type="paragraph" w:styleId="Citationintense">
     <w:name w:val="Intense Quote"/>
     <w:basedOn w:val="Normal"/>
     <w:next w:val="Normal"/>
-    <w:link w:val="IntenseQuoteChar"/>
+    <w:link w:val="CitationintenseCar"/>
     <w:uiPriority w:val="30"/>
     <w:qFormat/>
     <w:rsid w:val="00890116"/>
@@ -1562,10 +4450,10 @@
       <w:color w:val="0F4761" w:themeColor="accent1" w:themeShade="BF"/>
     </w:rPr>
   </w:style>
-  <w:style w:type="character" w:customStyle="1" w:styleId="IntenseQuoteChar">
-    <w:name w:val="Intense Quote Char"/>
-    <w:basedOn w:val="DefaultParagraphFont"/>
-    <w:link w:val="IntenseQuote"/>
+  <w:style w:type="character" w:customStyle="1" w:styleId="CitationintenseCar">
+    <w:name w:val="Citation intense Car"/>
+    <w:basedOn w:val="Policepardfaut"/>
+    <w:link w:val="Citationintense"/>
     <w:uiPriority w:val="30"/>
     <w:rsid w:val="00890116"/>
     <w:rPr>
@@ -1574,9 +4462,9 @@
       <w:color w:val="0F4761" w:themeColor="accent1" w:themeShade="BF"/>
     </w:rPr>
   </w:style>
-  <w:style w:type="character" w:styleId="IntenseReference">
+  <w:style w:type="character" w:styleId="Rfrenceintense">
     <w:name w:val="Intense Reference"/>
-    <w:basedOn w:val="DefaultParagraphFont"/>
+    <w:basedOn w:val="Policepardfaut"/>
     <w:uiPriority w:val="32"/>
     <w:qFormat/>
     <w:rsid w:val="00890116"/>
@@ -1588,9 +4476,9 @@
       <w:spacing w:val="5"/>
     </w:rPr>
   </w:style>
-  <w:style w:type="paragraph" w:customStyle="1" w:styleId="Titre">
-    <w:name w:val="Titre"/>
-    <w:basedOn w:val="Title"/>
+  <w:style w:type="paragraph" w:customStyle="1" w:styleId="Titre10">
+    <w:name w:val="Titre1"/>
+    <w:basedOn w:val="Titre"/>
     <w:qFormat/>
     <w:rsid w:val="00890116"/>
     <w:pPr>
@@ -1609,9 +4497,9 @@
       <w:rFonts w:ascii="Rockwell" w:hAnsi="Rockwell"/>
     </w:rPr>
   </w:style>
-  <w:style w:type="character" w:styleId="Hyperlink">
+  <w:style w:type="character" w:styleId="Lienhypertexte">
     <w:name w:val="Hyperlink"/>
-    <w:basedOn w:val="DefaultParagraphFont"/>
+    <w:basedOn w:val="Policepardfaut"/>
     <w:uiPriority w:val="99"/>
     <w:unhideWhenUsed/>
     <w:rsid w:val="002B11D7"/>
@@ -1620,9 +4508,9 @@
       <w:u w:val="single"/>
     </w:rPr>
   </w:style>
-  <w:style w:type="character" w:styleId="UnresolvedMention">
+  <w:style w:type="character" w:styleId="Mentionnonrsolue">
     <w:name w:val="Unresolved Mention"/>
-    <w:basedOn w:val="DefaultParagraphFont"/>
+    <w:basedOn w:val="Policepardfaut"/>
     <w:uiPriority w:val="99"/>
     <w:semiHidden/>
     <w:unhideWhenUsed/>
@@ -1630,6 +4518,57 @@
     <w:rPr>
       <w:color w:val="605E5C"/>
       <w:shd w:val="clear" w:color="auto" w:fill="E1DFDD"/>
+    </w:rPr>
+  </w:style>
+  <w:style w:type="character" w:styleId="Lienhypertextesuivivisit">
+    <w:name w:val="FollowedHyperlink"/>
+    <w:basedOn w:val="Policepardfaut"/>
+    <w:uiPriority w:val="99"/>
+    <w:semiHidden/>
+    <w:unhideWhenUsed/>
+    <w:rsid w:val="003C336A"/>
+    <w:rPr>
+      <w:color w:val="96607D" w:themeColor="followedHyperlink"/>
+      <w:u w:val="single"/>
+    </w:rPr>
+  </w:style>
+  <w:style w:type="paragraph" w:styleId="Notedefin">
+    <w:name w:val="endnote text"/>
+    <w:basedOn w:val="Normal"/>
+    <w:link w:val="NotedefinCar"/>
+    <w:uiPriority w:val="99"/>
+    <w:semiHidden/>
+    <w:unhideWhenUsed/>
+    <w:rsid w:val="001229B5"/>
+    <w:pPr>
+      <w:spacing w:after="0" w:line="240" w:lineRule="auto"/>
+    </w:pPr>
+    <w:rPr>
+      <w:sz w:val="20"/>
+      <w:szCs w:val="20"/>
+    </w:rPr>
+  </w:style>
+  <w:style w:type="character" w:customStyle="1" w:styleId="NotedefinCar">
+    <w:name w:val="Note de fin Car"/>
+    <w:basedOn w:val="Policepardfaut"/>
+    <w:link w:val="Notedefin"/>
+    <w:uiPriority w:val="99"/>
+    <w:semiHidden/>
+    <w:rsid w:val="001229B5"/>
+    <w:rPr>
+      <w:sz w:val="20"/>
+      <w:szCs w:val="20"/>
+    </w:rPr>
+  </w:style>
+  <w:style w:type="character" w:styleId="Appeldenotedefin">
+    <w:name w:val="endnote reference"/>
+    <w:basedOn w:val="Policepardfaut"/>
+    <w:uiPriority w:val="99"/>
+    <w:semiHidden/>
+    <w:unhideWhenUsed/>
+    <w:rsid w:val="001229B5"/>
+    <w:rPr>
+      <w:vertAlign w:val="superscript"/>
     </w:rPr>
   </w:style>
 </w:styles>
@@ -1948,4 +4887,16 @@
     </a:ext>
   </a:extLst>
 </a:theme>
+</file>
+
+<file path=customXml/item1.xml><?xml version="1.0" encoding="utf-8"?>
+<b:Sources xmlns:b="http://schemas.openxmlformats.org/officeDocument/2006/bibliography" xmlns="http://schemas.openxmlformats.org/officeDocument/2006/bibliography" SelectedStyle="\APASixthEditionOfficeOnline.xsl" StyleName="APA" Version="6"/>
+</file>
+
+<file path=customXml/itemProps1.xml><?xml version="1.0" encoding="utf-8"?>
+<ds:datastoreItem xmlns:ds="http://schemas.openxmlformats.org/officeDocument/2006/customXml" ds:itemID="{B9A29C89-DDE3-4CC3-88E0-8CCF9BAD2D37}">
+  <ds:schemaRefs>
+    <ds:schemaRef ds:uri="http://schemas.openxmlformats.org/officeDocument/2006/bibliography"/>
+  </ds:schemaRefs>
+</ds:datastoreItem>
 </file>
</xml_diff>